<commit_message>
Make CDS layers visible with B I C naming across all products
</commit_message>
<xml_diff>
--- a/docs/customer/new-domains/ModuPorter-Native-Documentation-DE-0.3.0.docx
+++ b/docs/customer/new-domains/ModuPorter-Native-Documentation-DE-0.3.0.docx
@@ -11,11 +11,13 @@
       </w:r>
     </w:p>
     <w:p>
+      <w:pPr/>
       <w:r>
         <w:t>Version 0.3.0 | 11 October 2026 | KAOURI INNOVATECH</w:t>
       </w:r>
     </w:p>
     <w:p>
+      <w:pPr/>
       <w:r>
         <w:t>Diese Ausgabe ersetzt die Staging-Entwürfe von 0.1.0. Dokumentierte Strukturen lesen native SAP-Systemtabellen über Basic, Composite und Consumption. Zielvergleichsviews lesen ebenfalls native Tabellen. Das Paket ist unvollständig und noch nicht in SAP geprüft.</w:t>
       </w:r>
@@ -27,31 +29,23 @@
         <w:tblLook w:firstColumn="1" w:firstRow="1" w:lastColumn="0" w:lastRow="0" w:noHBand="0" w:noVBand="1" w:val="04A0"/>
       </w:tblPr>
       <w:tblGrid>
-        <w:gridCol w:w="3288"/>
-        <w:gridCol w:w="3288"/>
-        <w:gridCol w:w="3288"/>
+        <w:gridCol w:w="3289"/>
+        <w:gridCol w:w="3289"/>
+        <w:gridCol w:w="3289"/>
       </w:tblGrid>
       <w:tr>
         <w:trPr>
+          <w:cantSplit/>
           <w:tblHeader/>
-          <w:cantSplit/>
         </w:trPr>
         <w:tc>
           <w:tcPr>
-            <w:tcW w:type="dxa" w:w="3288"/>
-            <w:tcBorders>
-              <w:top w:val="single" w:sz="4" w:color="D9D9D9"/>
-              <w:left w:val="single" w:sz="4" w:color="D9D9D9"/>
-              <w:bottom w:val="single" w:sz="4" w:color="D9D9D9"/>
-              <w:right w:val="single" w:sz="4" w:color="D9D9D9"/>
-              <w:insideH w:val="single" w:sz="4" w:color="D9D9D9"/>
-              <w:insideV w:val="single" w:sz="4" w:color="D9D9D9"/>
-            </w:tcBorders>
+            <w:tcW w:type="dxa" w:w="3402"/>
             <w:shd w:fill="273D50"/>
           </w:tcPr>
           <w:p>
             <w:pPr>
-              <w:spacing w:after="80" w:before="80"/>
+              <w:spacing w:before="80" w:after="80"/>
             </w:pPr>
             <w:r>
               <w:rPr>
@@ -65,20 +59,12 @@
         </w:tc>
         <w:tc>
           <w:tcPr>
-            <w:tcW w:type="dxa" w:w="3288"/>
-            <w:tcBorders>
-              <w:top w:val="single" w:sz="4" w:color="D9D9D9"/>
-              <w:left w:val="single" w:sz="4" w:color="D9D9D9"/>
-              <w:bottom w:val="single" w:sz="4" w:color="D9D9D9"/>
-              <w:right w:val="single" w:sz="4" w:color="D9D9D9"/>
-              <w:insideH w:val="single" w:sz="4" w:color="D9D9D9"/>
-              <w:insideV w:val="single" w:sz="4" w:color="D9D9D9"/>
-            </w:tcBorders>
+            <w:tcW w:type="dxa" w:w="3231"/>
             <w:shd w:fill="273D50"/>
           </w:tcPr>
           <w:p>
             <w:pPr>
-              <w:spacing w:after="80" w:before="80"/>
+              <w:spacing w:before="80" w:after="80"/>
             </w:pPr>
             <w:r>
               <w:rPr>
@@ -92,20 +78,12 @@
         </w:tc>
         <w:tc>
           <w:tcPr>
-            <w:tcW w:type="dxa" w:w="3288"/>
-            <w:tcBorders>
-              <w:top w:val="single" w:sz="4" w:color="D9D9D9"/>
-              <w:left w:val="single" w:sz="4" w:color="D9D9D9"/>
-              <w:bottom w:val="single" w:sz="4" w:color="D9D9D9"/>
-              <w:right w:val="single" w:sz="4" w:color="D9D9D9"/>
-              <w:insideH w:val="single" w:sz="4" w:color="D9D9D9"/>
-              <w:insideV w:val="single" w:sz="4" w:color="D9D9D9"/>
-            </w:tcBorders>
+            <w:tcW w:type="dxa" w:w="3231"/>
             <w:shd w:fill="273D50"/>
           </w:tcPr>
           <w:p>
             <w:pPr>
-              <w:spacing w:after="80" w:before="80"/>
+              <w:spacing w:before="80" w:after="80"/>
             </w:pPr>
             <w:r>
               <w:rPr>
@@ -124,20 +102,12 @@
         </w:trPr>
         <w:tc>
           <w:tcPr>
-            <w:tcW w:type="dxa" w:w="3288"/>
-            <w:tcBorders>
-              <w:top w:val="single" w:sz="4" w:color="D9D9D9"/>
-              <w:left w:val="single" w:sz="4" w:color="D9D9D9"/>
-              <w:bottom w:val="single" w:sz="4" w:color="D9D9D9"/>
-              <w:right w:val="single" w:sz="4" w:color="D9D9D9"/>
-              <w:insideH w:val="single" w:sz="4" w:color="D9D9D9"/>
-              <w:insideV w:val="single" w:sz="4" w:color="D9D9D9"/>
-            </w:tcBorders>
+            <w:tcW w:type="dxa" w:w="3402"/>
             <w:shd w:fill="F2F5F7"/>
           </w:tcPr>
           <w:p>
             <w:pPr>
-              <w:spacing w:after="80" w:before="80"/>
+              <w:spacing w:before="80" w:after="80"/>
             </w:pPr>
             <w:r>
               <w:rPr>
@@ -151,20 +121,12 @@
         </w:tc>
         <w:tc>
           <w:tcPr>
-            <w:tcW w:type="dxa" w:w="3288"/>
-            <w:tcBorders>
-              <w:top w:val="single" w:sz="4" w:color="D9D9D9"/>
-              <w:left w:val="single" w:sz="4" w:color="D9D9D9"/>
-              <w:bottom w:val="single" w:sz="4" w:color="D9D9D9"/>
-              <w:right w:val="single" w:sz="4" w:color="D9D9D9"/>
-              <w:insideH w:val="single" w:sz="4" w:color="D9D9D9"/>
-              <w:insideV w:val="single" w:sz="4" w:color="D9D9D9"/>
-            </w:tcBorders>
+            <w:tcW w:type="dxa" w:w="3231"/>
             <w:shd w:fill="F2F5F7"/>
           </w:tcPr>
           <w:p>
             <w:pPr>
-              <w:spacing w:after="80" w:before="80"/>
+              <w:spacing w:before="80" w:after="80"/>
             </w:pPr>
             <w:r>
               <w:rPr>
@@ -178,20 +140,12 @@
         </w:tc>
         <w:tc>
           <w:tcPr>
-            <w:tcW w:type="dxa" w:w="3288"/>
-            <w:tcBorders>
-              <w:top w:val="single" w:sz="4" w:color="D9D9D9"/>
-              <w:left w:val="single" w:sz="4" w:color="D9D9D9"/>
-              <w:bottom w:val="single" w:sz="4" w:color="D9D9D9"/>
-              <w:right w:val="single" w:sz="4" w:color="D9D9D9"/>
-              <w:insideH w:val="single" w:sz="4" w:color="D9D9D9"/>
-              <w:insideV w:val="single" w:sz="4" w:color="D9D9D9"/>
-            </w:tcBorders>
+            <w:tcW w:type="dxa" w:w="3231"/>
             <w:shd w:fill="F2F5F7"/>
           </w:tcPr>
           <w:p>
             <w:pPr>
-              <w:spacing w:after="80" w:before="80"/>
+              <w:spacing w:before="80" w:after="80"/>
             </w:pPr>
             <w:r>
               <w:rPr>
@@ -210,20 +164,12 @@
         </w:trPr>
         <w:tc>
           <w:tcPr>
-            <w:tcW w:type="dxa" w:w="3288"/>
-            <w:tcBorders>
-              <w:top w:val="single" w:sz="4" w:color="D9D9D9"/>
-              <w:left w:val="single" w:sz="4" w:color="D9D9D9"/>
-              <w:bottom w:val="single" w:sz="4" w:color="D9D9D9"/>
-              <w:right w:val="single" w:sz="4" w:color="D9D9D9"/>
-              <w:insideH w:val="single" w:sz="4" w:color="D9D9D9"/>
-              <w:insideV w:val="single" w:sz="4" w:color="D9D9D9"/>
-            </w:tcBorders>
+            <w:tcW w:type="dxa" w:w="3402"/>
             <w:shd w:fill="FFFFFF"/>
           </w:tcPr>
           <w:p>
             <w:pPr>
-              <w:spacing w:after="80" w:before="80"/>
+              <w:spacing w:before="80" w:after="80"/>
             </w:pPr>
             <w:r>
               <w:rPr>
@@ -237,20 +183,12 @@
         </w:tc>
         <w:tc>
           <w:tcPr>
-            <w:tcW w:type="dxa" w:w="3288"/>
-            <w:tcBorders>
-              <w:top w:val="single" w:sz="4" w:color="D9D9D9"/>
-              <w:left w:val="single" w:sz="4" w:color="D9D9D9"/>
-              <w:bottom w:val="single" w:sz="4" w:color="D9D9D9"/>
-              <w:right w:val="single" w:sz="4" w:color="D9D9D9"/>
-              <w:insideH w:val="single" w:sz="4" w:color="D9D9D9"/>
-              <w:insideV w:val="single" w:sz="4" w:color="D9D9D9"/>
-            </w:tcBorders>
+            <w:tcW w:type="dxa" w:w="3231"/>
             <w:shd w:fill="FFFFFF"/>
           </w:tcPr>
           <w:p>
             <w:pPr>
-              <w:spacing w:after="80" w:before="80"/>
+              <w:spacing w:before="80" w:after="80"/>
             </w:pPr>
             <w:r>
               <w:rPr>
@@ -264,20 +202,12 @@
         </w:tc>
         <w:tc>
           <w:tcPr>
-            <w:tcW w:type="dxa" w:w="3288"/>
-            <w:tcBorders>
-              <w:top w:val="single" w:sz="4" w:color="D9D9D9"/>
-              <w:left w:val="single" w:sz="4" w:color="D9D9D9"/>
-              <w:bottom w:val="single" w:sz="4" w:color="D9D9D9"/>
-              <w:right w:val="single" w:sz="4" w:color="D9D9D9"/>
-              <w:insideH w:val="single" w:sz="4" w:color="D9D9D9"/>
-              <w:insideV w:val="single" w:sz="4" w:color="D9D9D9"/>
-            </w:tcBorders>
+            <w:tcW w:type="dxa" w:w="3231"/>
             <w:shd w:fill="FFFFFF"/>
           </w:tcPr>
           <w:p>
             <w:pPr>
-              <w:spacing w:after="80" w:before="80"/>
+              <w:spacing w:before="80" w:after="80"/>
             </w:pPr>
             <w:r>
               <w:rPr>
@@ -296,20 +226,12 @@
         </w:trPr>
         <w:tc>
           <w:tcPr>
-            <w:tcW w:type="dxa" w:w="3288"/>
-            <w:tcBorders>
-              <w:top w:val="single" w:sz="4" w:color="D9D9D9"/>
-              <w:left w:val="single" w:sz="4" w:color="D9D9D9"/>
-              <w:bottom w:val="single" w:sz="4" w:color="D9D9D9"/>
-              <w:right w:val="single" w:sz="4" w:color="D9D9D9"/>
-              <w:insideH w:val="single" w:sz="4" w:color="D9D9D9"/>
-              <w:insideV w:val="single" w:sz="4" w:color="D9D9D9"/>
-            </w:tcBorders>
+            <w:tcW w:type="dxa" w:w="3402"/>
             <w:shd w:fill="F2F5F7"/>
           </w:tcPr>
           <w:p>
             <w:pPr>
-              <w:spacing w:after="80" w:before="80"/>
+              <w:spacing w:before="80" w:after="80"/>
             </w:pPr>
             <w:r>
               <w:rPr>
@@ -323,20 +245,12 @@
         </w:tc>
         <w:tc>
           <w:tcPr>
-            <w:tcW w:type="dxa" w:w="3288"/>
-            <w:tcBorders>
-              <w:top w:val="single" w:sz="4" w:color="D9D9D9"/>
-              <w:left w:val="single" w:sz="4" w:color="D9D9D9"/>
-              <w:bottom w:val="single" w:sz="4" w:color="D9D9D9"/>
-              <w:right w:val="single" w:sz="4" w:color="D9D9D9"/>
-              <w:insideH w:val="single" w:sz="4" w:color="D9D9D9"/>
-              <w:insideV w:val="single" w:sz="4" w:color="D9D9D9"/>
-            </w:tcBorders>
+            <w:tcW w:type="dxa" w:w="3231"/>
             <w:shd w:fill="F2F5F7"/>
           </w:tcPr>
           <w:p>
             <w:pPr>
-              <w:spacing w:after="80" w:before="80"/>
+              <w:spacing w:before="80" w:after="80"/>
             </w:pPr>
             <w:r>
               <w:rPr>
@@ -350,20 +264,12 @@
         </w:tc>
         <w:tc>
           <w:tcPr>
-            <w:tcW w:type="dxa" w:w="3288"/>
-            <w:tcBorders>
-              <w:top w:val="single" w:sz="4" w:color="D9D9D9"/>
-              <w:left w:val="single" w:sz="4" w:color="D9D9D9"/>
-              <w:bottom w:val="single" w:sz="4" w:color="D9D9D9"/>
-              <w:right w:val="single" w:sz="4" w:color="D9D9D9"/>
-              <w:insideH w:val="single" w:sz="4" w:color="D9D9D9"/>
-              <w:insideV w:val="single" w:sz="4" w:color="D9D9D9"/>
-            </w:tcBorders>
+            <w:tcW w:type="dxa" w:w="3231"/>
             <w:shd w:fill="F2F5F7"/>
           </w:tcPr>
           <w:p>
             <w:pPr>
-              <w:spacing w:after="80" w:before="80"/>
+              <w:spacing w:before="80" w:after="80"/>
             </w:pPr>
             <w:r>
               <w:rPr>
@@ -382,20 +288,12 @@
         </w:trPr>
         <w:tc>
           <w:tcPr>
-            <w:tcW w:type="dxa" w:w="3288"/>
-            <w:tcBorders>
-              <w:top w:val="single" w:sz="4" w:color="D9D9D9"/>
-              <w:left w:val="single" w:sz="4" w:color="D9D9D9"/>
-              <w:bottom w:val="single" w:sz="4" w:color="D9D9D9"/>
-              <w:right w:val="single" w:sz="4" w:color="D9D9D9"/>
-              <w:insideH w:val="single" w:sz="4" w:color="D9D9D9"/>
-              <w:insideV w:val="single" w:sz="4" w:color="D9D9D9"/>
-            </w:tcBorders>
+            <w:tcW w:type="dxa" w:w="3402"/>
             <w:shd w:fill="FFFFFF"/>
           </w:tcPr>
           <w:p>
             <w:pPr>
-              <w:spacing w:after="80" w:before="80"/>
+              <w:spacing w:before="80" w:after="80"/>
             </w:pPr>
             <w:r>
               <w:rPr>
@@ -409,20 +307,12 @@
         </w:tc>
         <w:tc>
           <w:tcPr>
-            <w:tcW w:type="dxa" w:w="3288"/>
-            <w:tcBorders>
-              <w:top w:val="single" w:sz="4" w:color="D9D9D9"/>
-              <w:left w:val="single" w:sz="4" w:color="D9D9D9"/>
-              <w:bottom w:val="single" w:sz="4" w:color="D9D9D9"/>
-              <w:right w:val="single" w:sz="4" w:color="D9D9D9"/>
-              <w:insideH w:val="single" w:sz="4" w:color="D9D9D9"/>
-              <w:insideV w:val="single" w:sz="4" w:color="D9D9D9"/>
-            </w:tcBorders>
+            <w:tcW w:type="dxa" w:w="3231"/>
             <w:shd w:fill="FFFFFF"/>
           </w:tcPr>
           <w:p>
             <w:pPr>
-              <w:spacing w:after="80" w:before="80"/>
+              <w:spacing w:before="80" w:after="80"/>
             </w:pPr>
             <w:r>
               <w:rPr>
@@ -436,20 +326,12 @@
         </w:tc>
         <w:tc>
           <w:tcPr>
-            <w:tcW w:type="dxa" w:w="3288"/>
-            <w:tcBorders>
-              <w:top w:val="single" w:sz="4" w:color="D9D9D9"/>
-              <w:left w:val="single" w:sz="4" w:color="D9D9D9"/>
-              <w:bottom w:val="single" w:sz="4" w:color="D9D9D9"/>
-              <w:right w:val="single" w:sz="4" w:color="D9D9D9"/>
-              <w:insideH w:val="single" w:sz="4" w:color="D9D9D9"/>
-              <w:insideV w:val="single" w:sz="4" w:color="D9D9D9"/>
-            </w:tcBorders>
+            <w:tcW w:type="dxa" w:w="3231"/>
             <w:shd w:fill="FFFFFF"/>
           </w:tcPr>
           <w:p>
             <w:pPr>
-              <w:spacing w:after="80" w:before="80"/>
+              <w:spacing w:before="80" w:after="80"/>
             </w:pPr>
             <w:r>
               <w:rPr>
@@ -465,6 +347,7 @@
     </w:tbl>
     <w:p/>
     <w:p>
+      <w:pPr/>
       <w:r>
         <w:t>27 native Strukturentwürfe und 45 offene Strukturen im bestehenden Plan mit 32 Modulen. Auch native Entwürfe besitzen fehlende Nutzdaten; Details stehen in Native-Coverage.csv und den Produkthandbüchern. Die 140 CDS-Objekte enthalten keine kundeneigenen Stagingtabellen oder Ladeberichte.</w:t>
       </w:r>
@@ -478,11 +361,13 @@
       </w:r>
     </w:p>
     <w:p>
+      <w:pPr/>
       <w:r>
-        <w:t>/SCWM/LAGP → ZWMX_I_StorageBinData → ZWMX_I_StorageBin → ZWMX_C_StorageBinMig</w:t>
+        <w:t>/SCWM/LAGP → ZWMX_B_StorageBinData → ZWMX_I_StorageBin → ZWMX_C_StorageBinMig</w:t>
       </w:r>
     </w:p>
     <w:p>
+      <w:pPr/>
       <w:r>
         <w:t>Basic erhält native Felder und Schlüssel. Composite stellt dieselben Datensätze mit fachlichen Spaltennamen bereit. Consumption liefert die dokumentierte Exportstruktur. Keine zusätzliche Z-Stagingtabelle.</w:t>
       </w:r>
@@ -496,6 +381,7 @@
       </w:r>
     </w:p>
     <w:p>
+      <w:pPr/>
       <w:r>
         <w:t>Öffentliche SAP-Quellen dokumentieren Tabellen und Feldverwendung. Sie bestätigen keine vollständigen DDIC-Schlüssel oder Release-Kompatibilität im Kundensystem. Aktivierung, Berechtigungen und fachliche Vollständigkeit bleiben ungeprüft. Kein Buchungsadapter ist enthalten.</w:t>
       </w:r>
@@ -514,46 +400,55 @@
       </w:r>
     </w:p>
     <w:p>
+      <w:pPr/>
       <w:r>
         <w:t>1. Anwendung und Release bestätigen. EWM ist nicht LE-WM; klassische EHS-Spezifikationen sind nicht moderne EHSM-Vorfälle. Native Tabellen müssen vorhanden sein.</w:t>
       </w:r>
     </w:p>
     <w:p>
+      <w:pPr/>
       <w:r>
         <w:t>2. Alle Felder und vollständigen Schlüssel in SE11/ADT prüfen. Den nativen Lesebericht zum Export der tatsächlichen DDIC-Metadaten nutzen; migration_ddic.py gegen die .fields.csv ausführen.</w:t>
       </w:r>
     </w:p>
     <w:p>
+      <w:pPr/>
       <w:r>
         <w:t>3. Quell-/Ziel-ZIP getrennt importieren. ACTIVATION_ORDER.txt befolgen. Quelle verwendet klassische CDS, Ziel View Entities. Schlüssel- und Release-Annahmen vor Aktivierung prüfen.</w:t>
       </w:r>
     </w:p>
     <w:p>
+      <w:pPr/>
       <w:r>
         <w:t>4. Erlaubte und eingeschränkte Benutzer sowie Mandantentrennung testen. Keine DCL enthalten. S_TABU_NAM im Bericht schützt nicht automatisch jeden CDS-Konsumenten.</w:t>
       </w:r>
     </w:p>
     <w:p>
+      <w:pPr/>
       <w:r>
         <w:t>5. Consumption-Daten mit CDS-Spaltennamen exportieren. System, Mandant, Exportzeit und Population separat protokollieren. Der Tabellenbericht exportiert Rohspalten ohne Consumption-Filter.</w:t>
       </w:r>
     </w:p>
     <w:p>
+      <w:pPr/>
       <w:r>
         <w:t>6. Freigegebene vollständige Schlüssel in customer/selection eintragen. migration_run.py mit customer/customer-cohort-project.json ausführen. Leere Auswahl erzeugt null Zeilen.</w:t>
       </w:r>
     </w:p>
     <w:p>
+      <w:pPr/>
       <w:r>
         <w:t>7. Dieselbe Zielpopulation exportieren. Geänderte Nummern und neu erzeugte UUIDs vor dem Vergleich zuordnen und separat protokollieren. migration_prepare.py compare nutzen.</w:t>
       </w:r>
     </w:p>
     <w:p>
+      <w:pPr/>
       <w:r>
         <w:t>8. Status, Stichtag, Eltern-/Kindbeziehungen und fehlende Nutzdaten fachlich prüfen. EHS-Änderungsstände erhalten; TM-Kategorie und Fallarten bestätigen. Zählviews zählen breite Kandidatenbestände.</w:t>
       </w:r>
     </w:p>
     <w:p>
+      <w:pPr/>
       <w:r>
         <w:t>9. Reale SAP-Nachweise in customer/TEST_RESULTS.csv sichern. Künstliche CSV-Beispiele prüfen nur lokale Werkzeuge und dürfen nicht in SAP geladen werden.</w:t>
       </w:r>
@@ -572,6 +467,7 @@
       </w:r>
     </w:p>
     <w:p>
+      <w:pPr/>
       <w:r>
         <w:t>7 native Entwürfe; 9 offene Strukturen. Alle SAP-Prüfungen stehen aus.</w:t>
       </w:r>
@@ -583,31 +479,23 @@
         <w:tblLook w:firstColumn="1" w:firstRow="1" w:lastColumn="0" w:lastRow="0" w:noHBand="0" w:noVBand="1" w:val="04A0"/>
       </w:tblPr>
       <w:tblGrid>
-        <w:gridCol w:w="2381"/>
-        <w:gridCol w:w="3458"/>
-        <w:gridCol w:w="4025"/>
+        <w:gridCol w:w="3289"/>
+        <w:gridCol w:w="3289"/>
+        <w:gridCol w:w="3289"/>
       </w:tblGrid>
       <w:tr>
         <w:trPr>
+          <w:cantSplit/>
           <w:tblHeader/>
-          <w:cantSplit/>
         </w:trPr>
         <w:tc>
           <w:tcPr>
-            <w:tcW w:type="dxa" w:w="2381"/>
-            <w:tcBorders>
-              <w:top w:val="single" w:sz="4" w:color="D9D9D9"/>
-              <w:left w:val="single" w:sz="4" w:color="D9D9D9"/>
-              <w:bottom w:val="single" w:sz="4" w:color="D9D9D9"/>
-              <w:right w:val="single" w:sz="4" w:color="D9D9D9"/>
-              <w:insideH w:val="single" w:sz="4" w:color="D9D9D9"/>
-              <w:insideV w:val="single" w:sz="4" w:color="D9D9D9"/>
-            </w:tcBorders>
+            <w:tcW w:type="dxa" w:w="2324"/>
             <w:shd w:fill="273D50"/>
           </w:tcPr>
           <w:p>
             <w:pPr>
-              <w:spacing w:after="80" w:before="80"/>
+              <w:spacing w:before="80" w:after="80"/>
             </w:pPr>
             <w:r>
               <w:rPr>
@@ -622,19 +510,11 @@
         <w:tc>
           <w:tcPr>
             <w:tcW w:type="dxa" w:w="3458"/>
-            <w:tcBorders>
-              <w:top w:val="single" w:sz="4" w:color="D9D9D9"/>
-              <w:left w:val="single" w:sz="4" w:color="D9D9D9"/>
-              <w:bottom w:val="single" w:sz="4" w:color="D9D9D9"/>
-              <w:right w:val="single" w:sz="4" w:color="D9D9D9"/>
-              <w:insideH w:val="single" w:sz="4" w:color="D9D9D9"/>
-              <w:insideV w:val="single" w:sz="4" w:color="D9D9D9"/>
-            </w:tcBorders>
             <w:shd w:fill="273D50"/>
           </w:tcPr>
           <w:p>
             <w:pPr>
-              <w:spacing w:after="80" w:before="80"/>
+              <w:spacing w:before="80" w:after="80"/>
             </w:pPr>
             <w:r>
               <w:rPr>
@@ -648,20 +528,12 @@
         </w:tc>
         <w:tc>
           <w:tcPr>
-            <w:tcW w:type="dxa" w:w="4025"/>
-            <w:tcBorders>
-              <w:top w:val="single" w:sz="4" w:color="D9D9D9"/>
-              <w:left w:val="single" w:sz="4" w:color="D9D9D9"/>
-              <w:bottom w:val="single" w:sz="4" w:color="D9D9D9"/>
-              <w:right w:val="single" w:sz="4" w:color="D9D9D9"/>
-              <w:insideH w:val="single" w:sz="4" w:color="D9D9D9"/>
-              <w:insideV w:val="single" w:sz="4" w:color="D9D9D9"/>
-            </w:tcBorders>
+            <w:tcW w:type="dxa" w:w="4082"/>
             <w:shd w:fill="273D50"/>
           </w:tcPr>
           <w:p>
             <w:pPr>
-              <w:spacing w:after="80" w:before="80"/>
+              <w:spacing w:before="80" w:after="80"/>
             </w:pPr>
             <w:r>
               <w:rPr>
@@ -680,20 +552,12 @@
         </w:trPr>
         <w:tc>
           <w:tcPr>
-            <w:tcW w:type="dxa" w:w="2381"/>
-            <w:tcBorders>
-              <w:top w:val="single" w:sz="4" w:color="D9D9D9"/>
-              <w:left w:val="single" w:sz="4" w:color="D9D9D9"/>
-              <w:bottom w:val="single" w:sz="4" w:color="D9D9D9"/>
-              <w:right w:val="single" w:sz="4" w:color="D9D9D9"/>
-              <w:insideH w:val="single" w:sz="4" w:color="D9D9D9"/>
-              <w:insideV w:val="single" w:sz="4" w:color="D9D9D9"/>
-            </w:tcBorders>
+            <w:tcW w:type="dxa" w:w="2324"/>
             <w:shd w:fill="F2F5F7"/>
           </w:tcPr>
           <w:p>
             <w:pPr>
-              <w:spacing w:after="80" w:before="80"/>
+              <w:spacing w:before="80" w:after="80"/>
             </w:pPr>
             <w:r>
               <w:rPr>
@@ -708,19 +572,11 @@
         <w:tc>
           <w:tcPr>
             <w:tcW w:type="dxa" w:w="3458"/>
-            <w:tcBorders>
-              <w:top w:val="single" w:sz="4" w:color="D9D9D9"/>
-              <w:left w:val="single" w:sz="4" w:color="D9D9D9"/>
-              <w:bottom w:val="single" w:sz="4" w:color="D9D9D9"/>
-              <w:right w:val="single" w:sz="4" w:color="D9D9D9"/>
-              <w:insideH w:val="single" w:sz="4" w:color="D9D9D9"/>
-              <w:insideV w:val="single" w:sz="4" w:color="D9D9D9"/>
-            </w:tcBorders>
             <w:shd w:fill="F2F5F7"/>
           </w:tcPr>
           <w:p>
             <w:pPr>
-              <w:spacing w:after="80" w:before="80"/>
+              <w:spacing w:before="80" w:after="80"/>
             </w:pPr>
             <w:r>
               <w:rPr>
@@ -734,20 +590,12 @@
         </w:tc>
         <w:tc>
           <w:tcPr>
-            <w:tcW w:type="dxa" w:w="4025"/>
-            <w:tcBorders>
-              <w:top w:val="single" w:sz="4" w:color="D9D9D9"/>
-              <w:left w:val="single" w:sz="4" w:color="D9D9D9"/>
-              <w:bottom w:val="single" w:sz="4" w:color="D9D9D9"/>
-              <w:right w:val="single" w:sz="4" w:color="D9D9D9"/>
-              <w:insideH w:val="single" w:sz="4" w:color="D9D9D9"/>
-              <w:insideV w:val="single" w:sz="4" w:color="D9D9D9"/>
-            </w:tcBorders>
+            <w:tcW w:type="dxa" w:w="4082"/>
             <w:shd w:fill="F2F5F7"/>
           </w:tcPr>
           <w:p>
             <w:pPr>
-              <w:spacing w:after="80" w:before="80"/>
+              <w:spacing w:before="80" w:after="80"/>
             </w:pPr>
             <w:r>
               <w:rPr>
@@ -766,20 +614,12 @@
         </w:trPr>
         <w:tc>
           <w:tcPr>
-            <w:tcW w:type="dxa" w:w="2381"/>
-            <w:tcBorders>
-              <w:top w:val="single" w:sz="4" w:color="D9D9D9"/>
-              <w:left w:val="single" w:sz="4" w:color="D9D9D9"/>
-              <w:bottom w:val="single" w:sz="4" w:color="D9D9D9"/>
-              <w:right w:val="single" w:sz="4" w:color="D9D9D9"/>
-              <w:insideH w:val="single" w:sz="4" w:color="D9D9D9"/>
-              <w:insideV w:val="single" w:sz="4" w:color="D9D9D9"/>
-            </w:tcBorders>
+            <w:tcW w:type="dxa" w:w="2324"/>
             <w:shd w:fill="FFFFFF"/>
           </w:tcPr>
           <w:p>
             <w:pPr>
-              <w:spacing w:after="80" w:before="80"/>
+              <w:spacing w:before="80" w:after="80"/>
             </w:pPr>
             <w:r>
               <w:rPr>
@@ -794,19 +634,11 @@
         <w:tc>
           <w:tcPr>
             <w:tcW w:type="dxa" w:w="3458"/>
-            <w:tcBorders>
-              <w:top w:val="single" w:sz="4" w:color="D9D9D9"/>
-              <w:left w:val="single" w:sz="4" w:color="D9D9D9"/>
-              <w:bottom w:val="single" w:sz="4" w:color="D9D9D9"/>
-              <w:right w:val="single" w:sz="4" w:color="D9D9D9"/>
-              <w:insideH w:val="single" w:sz="4" w:color="D9D9D9"/>
-              <w:insideV w:val="single" w:sz="4" w:color="D9D9D9"/>
-            </w:tcBorders>
             <w:shd w:fill="FFFFFF"/>
           </w:tcPr>
           <w:p>
             <w:pPr>
-              <w:spacing w:after="80" w:before="80"/>
+              <w:spacing w:before="80" w:after="80"/>
             </w:pPr>
             <w:r>
               <w:rPr>
@@ -820,20 +652,12 @@
         </w:tc>
         <w:tc>
           <w:tcPr>
-            <w:tcW w:type="dxa" w:w="4025"/>
-            <w:tcBorders>
-              <w:top w:val="single" w:sz="4" w:color="D9D9D9"/>
-              <w:left w:val="single" w:sz="4" w:color="D9D9D9"/>
-              <w:bottom w:val="single" w:sz="4" w:color="D9D9D9"/>
-              <w:right w:val="single" w:sz="4" w:color="D9D9D9"/>
-              <w:insideH w:val="single" w:sz="4" w:color="D9D9D9"/>
-              <w:insideV w:val="single" w:sz="4" w:color="D9D9D9"/>
-            </w:tcBorders>
+            <w:tcW w:type="dxa" w:w="4082"/>
             <w:shd w:fill="FFFFFF"/>
           </w:tcPr>
           <w:p>
             <w:pPr>
-              <w:spacing w:after="80" w:before="80"/>
+              <w:spacing w:before="80" w:after="80"/>
             </w:pPr>
             <w:r>
               <w:rPr>
@@ -852,20 +676,12 @@
         </w:trPr>
         <w:tc>
           <w:tcPr>
-            <w:tcW w:type="dxa" w:w="2381"/>
-            <w:tcBorders>
-              <w:top w:val="single" w:sz="4" w:color="D9D9D9"/>
-              <w:left w:val="single" w:sz="4" w:color="D9D9D9"/>
-              <w:bottom w:val="single" w:sz="4" w:color="D9D9D9"/>
-              <w:right w:val="single" w:sz="4" w:color="D9D9D9"/>
-              <w:insideH w:val="single" w:sz="4" w:color="D9D9D9"/>
-              <w:insideV w:val="single" w:sz="4" w:color="D9D9D9"/>
-            </w:tcBorders>
+            <w:tcW w:type="dxa" w:w="2324"/>
             <w:shd w:fill="F2F5F7"/>
           </w:tcPr>
           <w:p>
             <w:pPr>
-              <w:spacing w:after="80" w:before="80"/>
+              <w:spacing w:before="80" w:after="80"/>
             </w:pPr>
             <w:r>
               <w:rPr>
@@ -880,19 +696,11 @@
         <w:tc>
           <w:tcPr>
             <w:tcW w:type="dxa" w:w="3458"/>
-            <w:tcBorders>
-              <w:top w:val="single" w:sz="4" w:color="D9D9D9"/>
-              <w:left w:val="single" w:sz="4" w:color="D9D9D9"/>
-              <w:bottom w:val="single" w:sz="4" w:color="D9D9D9"/>
-              <w:right w:val="single" w:sz="4" w:color="D9D9D9"/>
-              <w:insideH w:val="single" w:sz="4" w:color="D9D9D9"/>
-              <w:insideV w:val="single" w:sz="4" w:color="D9D9D9"/>
-            </w:tcBorders>
             <w:shd w:fill="F2F5F7"/>
           </w:tcPr>
           <w:p>
             <w:pPr>
-              <w:spacing w:after="80" w:before="80"/>
+              <w:spacing w:before="80" w:after="80"/>
             </w:pPr>
             <w:r>
               <w:rPr>
@@ -906,20 +714,12 @@
         </w:tc>
         <w:tc>
           <w:tcPr>
-            <w:tcW w:type="dxa" w:w="4025"/>
-            <w:tcBorders>
-              <w:top w:val="single" w:sz="4" w:color="D9D9D9"/>
-              <w:left w:val="single" w:sz="4" w:color="D9D9D9"/>
-              <w:bottom w:val="single" w:sz="4" w:color="D9D9D9"/>
-              <w:right w:val="single" w:sz="4" w:color="D9D9D9"/>
-              <w:insideH w:val="single" w:sz="4" w:color="D9D9D9"/>
-              <w:insideV w:val="single" w:sz="4" w:color="D9D9D9"/>
-            </w:tcBorders>
+            <w:tcW w:type="dxa" w:w="4082"/>
             <w:shd w:fill="F2F5F7"/>
           </w:tcPr>
           <w:p>
             <w:pPr>
-              <w:spacing w:after="80" w:before="80"/>
+              <w:spacing w:before="80" w:after="80"/>
             </w:pPr>
             <w:r>
               <w:rPr>
@@ -938,20 +738,12 @@
         </w:trPr>
         <w:tc>
           <w:tcPr>
-            <w:tcW w:type="dxa" w:w="2381"/>
-            <w:tcBorders>
-              <w:top w:val="single" w:sz="4" w:color="D9D9D9"/>
-              <w:left w:val="single" w:sz="4" w:color="D9D9D9"/>
-              <w:bottom w:val="single" w:sz="4" w:color="D9D9D9"/>
-              <w:right w:val="single" w:sz="4" w:color="D9D9D9"/>
-              <w:insideH w:val="single" w:sz="4" w:color="D9D9D9"/>
-              <w:insideV w:val="single" w:sz="4" w:color="D9D9D9"/>
-            </w:tcBorders>
+            <w:tcW w:type="dxa" w:w="2324"/>
             <w:shd w:fill="FFFFFF"/>
           </w:tcPr>
           <w:p>
             <w:pPr>
-              <w:spacing w:after="80" w:before="80"/>
+              <w:spacing w:before="80" w:after="80"/>
             </w:pPr>
             <w:r>
               <w:rPr>
@@ -966,19 +758,11 @@
         <w:tc>
           <w:tcPr>
             <w:tcW w:type="dxa" w:w="3458"/>
-            <w:tcBorders>
-              <w:top w:val="single" w:sz="4" w:color="D9D9D9"/>
-              <w:left w:val="single" w:sz="4" w:color="D9D9D9"/>
-              <w:bottom w:val="single" w:sz="4" w:color="D9D9D9"/>
-              <w:right w:val="single" w:sz="4" w:color="D9D9D9"/>
-              <w:insideH w:val="single" w:sz="4" w:color="D9D9D9"/>
-              <w:insideV w:val="single" w:sz="4" w:color="D9D9D9"/>
-            </w:tcBorders>
             <w:shd w:fill="FFFFFF"/>
           </w:tcPr>
           <w:p>
             <w:pPr>
-              <w:spacing w:after="80" w:before="80"/>
+              <w:spacing w:before="80" w:after="80"/>
             </w:pPr>
             <w:r>
               <w:rPr>
@@ -992,20 +776,12 @@
         </w:tc>
         <w:tc>
           <w:tcPr>
-            <w:tcW w:type="dxa" w:w="4025"/>
-            <w:tcBorders>
-              <w:top w:val="single" w:sz="4" w:color="D9D9D9"/>
-              <w:left w:val="single" w:sz="4" w:color="D9D9D9"/>
-              <w:bottom w:val="single" w:sz="4" w:color="D9D9D9"/>
-              <w:right w:val="single" w:sz="4" w:color="D9D9D9"/>
-              <w:insideH w:val="single" w:sz="4" w:color="D9D9D9"/>
-              <w:insideV w:val="single" w:sz="4" w:color="D9D9D9"/>
-            </w:tcBorders>
+            <w:tcW w:type="dxa" w:w="4082"/>
             <w:shd w:fill="FFFFFF"/>
           </w:tcPr>
           <w:p>
             <w:pPr>
-              <w:spacing w:after="80" w:before="80"/>
+              <w:spacing w:before="80" w:after="80"/>
             </w:pPr>
             <w:r>
               <w:rPr>
@@ -1024,20 +800,12 @@
         </w:trPr>
         <w:tc>
           <w:tcPr>
-            <w:tcW w:type="dxa" w:w="2381"/>
-            <w:tcBorders>
-              <w:top w:val="single" w:sz="4" w:color="D9D9D9"/>
-              <w:left w:val="single" w:sz="4" w:color="D9D9D9"/>
-              <w:bottom w:val="single" w:sz="4" w:color="D9D9D9"/>
-              <w:right w:val="single" w:sz="4" w:color="D9D9D9"/>
-              <w:insideH w:val="single" w:sz="4" w:color="D9D9D9"/>
-              <w:insideV w:val="single" w:sz="4" w:color="D9D9D9"/>
-            </w:tcBorders>
+            <w:tcW w:type="dxa" w:w="2324"/>
             <w:shd w:fill="F2F5F7"/>
           </w:tcPr>
           <w:p>
             <w:pPr>
-              <w:spacing w:after="80" w:before="80"/>
+              <w:spacing w:before="80" w:after="80"/>
             </w:pPr>
             <w:r>
               <w:rPr>
@@ -1052,19 +820,11 @@
         <w:tc>
           <w:tcPr>
             <w:tcW w:type="dxa" w:w="3458"/>
-            <w:tcBorders>
-              <w:top w:val="single" w:sz="4" w:color="D9D9D9"/>
-              <w:left w:val="single" w:sz="4" w:color="D9D9D9"/>
-              <w:bottom w:val="single" w:sz="4" w:color="D9D9D9"/>
-              <w:right w:val="single" w:sz="4" w:color="D9D9D9"/>
-              <w:insideH w:val="single" w:sz="4" w:color="D9D9D9"/>
-              <w:insideV w:val="single" w:sz="4" w:color="D9D9D9"/>
-            </w:tcBorders>
             <w:shd w:fill="F2F5F7"/>
           </w:tcPr>
           <w:p>
             <w:pPr>
-              <w:spacing w:after="80" w:before="80"/>
+              <w:spacing w:before="80" w:after="80"/>
             </w:pPr>
             <w:r>
               <w:rPr>
@@ -1078,20 +838,12 @@
         </w:tc>
         <w:tc>
           <w:tcPr>
-            <w:tcW w:type="dxa" w:w="4025"/>
-            <w:tcBorders>
-              <w:top w:val="single" w:sz="4" w:color="D9D9D9"/>
-              <w:left w:val="single" w:sz="4" w:color="D9D9D9"/>
-              <w:bottom w:val="single" w:sz="4" w:color="D9D9D9"/>
-              <w:right w:val="single" w:sz="4" w:color="D9D9D9"/>
-              <w:insideH w:val="single" w:sz="4" w:color="D9D9D9"/>
-              <w:insideV w:val="single" w:sz="4" w:color="D9D9D9"/>
-            </w:tcBorders>
+            <w:tcW w:type="dxa" w:w="4082"/>
             <w:shd w:fill="F2F5F7"/>
           </w:tcPr>
           <w:p>
             <w:pPr>
-              <w:spacing w:after="80" w:before="80"/>
+              <w:spacing w:before="80" w:after="80"/>
             </w:pPr>
             <w:r>
               <w:rPr>
@@ -1110,20 +862,12 @@
         </w:trPr>
         <w:tc>
           <w:tcPr>
-            <w:tcW w:type="dxa" w:w="2381"/>
-            <w:tcBorders>
-              <w:top w:val="single" w:sz="4" w:color="D9D9D9"/>
-              <w:left w:val="single" w:sz="4" w:color="D9D9D9"/>
-              <w:bottom w:val="single" w:sz="4" w:color="D9D9D9"/>
-              <w:right w:val="single" w:sz="4" w:color="D9D9D9"/>
-              <w:insideH w:val="single" w:sz="4" w:color="D9D9D9"/>
-              <w:insideV w:val="single" w:sz="4" w:color="D9D9D9"/>
-            </w:tcBorders>
+            <w:tcW w:type="dxa" w:w="2324"/>
             <w:shd w:fill="FFFFFF"/>
           </w:tcPr>
           <w:p>
             <w:pPr>
-              <w:spacing w:after="80" w:before="80"/>
+              <w:spacing w:before="80" w:after="80"/>
             </w:pPr>
             <w:r>
               <w:rPr>
@@ -1138,19 +882,11 @@
         <w:tc>
           <w:tcPr>
             <w:tcW w:type="dxa" w:w="3458"/>
-            <w:tcBorders>
-              <w:top w:val="single" w:sz="4" w:color="D9D9D9"/>
-              <w:left w:val="single" w:sz="4" w:color="D9D9D9"/>
-              <w:bottom w:val="single" w:sz="4" w:color="D9D9D9"/>
-              <w:right w:val="single" w:sz="4" w:color="D9D9D9"/>
-              <w:insideH w:val="single" w:sz="4" w:color="D9D9D9"/>
-              <w:insideV w:val="single" w:sz="4" w:color="D9D9D9"/>
-            </w:tcBorders>
             <w:shd w:fill="FFFFFF"/>
           </w:tcPr>
           <w:p>
             <w:pPr>
-              <w:spacing w:after="80" w:before="80"/>
+              <w:spacing w:before="80" w:after="80"/>
             </w:pPr>
             <w:r>
               <w:rPr>
@@ -1164,20 +900,12 @@
         </w:tc>
         <w:tc>
           <w:tcPr>
-            <w:tcW w:type="dxa" w:w="4025"/>
-            <w:tcBorders>
-              <w:top w:val="single" w:sz="4" w:color="D9D9D9"/>
-              <w:left w:val="single" w:sz="4" w:color="D9D9D9"/>
-              <w:bottom w:val="single" w:sz="4" w:color="D9D9D9"/>
-              <w:right w:val="single" w:sz="4" w:color="D9D9D9"/>
-              <w:insideH w:val="single" w:sz="4" w:color="D9D9D9"/>
-              <w:insideV w:val="single" w:sz="4" w:color="D9D9D9"/>
-            </w:tcBorders>
+            <w:tcW w:type="dxa" w:w="4082"/>
             <w:shd w:fill="FFFFFF"/>
           </w:tcPr>
           <w:p>
             <w:pPr>
-              <w:spacing w:after="80" w:before="80"/>
+              <w:spacing w:before="80" w:after="80"/>
             </w:pPr>
             <w:r>
               <w:rPr>
@@ -1196,20 +924,12 @@
         </w:trPr>
         <w:tc>
           <w:tcPr>
-            <w:tcW w:type="dxa" w:w="2381"/>
-            <w:tcBorders>
-              <w:top w:val="single" w:sz="4" w:color="D9D9D9"/>
-              <w:left w:val="single" w:sz="4" w:color="D9D9D9"/>
-              <w:bottom w:val="single" w:sz="4" w:color="D9D9D9"/>
-              <w:right w:val="single" w:sz="4" w:color="D9D9D9"/>
-              <w:insideH w:val="single" w:sz="4" w:color="D9D9D9"/>
-              <w:insideV w:val="single" w:sz="4" w:color="D9D9D9"/>
-            </w:tcBorders>
+            <w:tcW w:type="dxa" w:w="2324"/>
             <w:shd w:fill="F2F5F7"/>
           </w:tcPr>
           <w:p>
             <w:pPr>
-              <w:spacing w:after="80" w:before="80"/>
+              <w:spacing w:before="80" w:after="80"/>
             </w:pPr>
             <w:r>
               <w:rPr>
@@ -1224,19 +944,11 @@
         <w:tc>
           <w:tcPr>
             <w:tcW w:type="dxa" w:w="3458"/>
-            <w:tcBorders>
-              <w:top w:val="single" w:sz="4" w:color="D9D9D9"/>
-              <w:left w:val="single" w:sz="4" w:color="D9D9D9"/>
-              <w:bottom w:val="single" w:sz="4" w:color="D9D9D9"/>
-              <w:right w:val="single" w:sz="4" w:color="D9D9D9"/>
-              <w:insideH w:val="single" w:sz="4" w:color="D9D9D9"/>
-              <w:insideV w:val="single" w:sz="4" w:color="D9D9D9"/>
-            </w:tcBorders>
             <w:shd w:fill="F2F5F7"/>
           </w:tcPr>
           <w:p>
             <w:pPr>
-              <w:spacing w:after="80" w:before="80"/>
+              <w:spacing w:before="80" w:after="80"/>
             </w:pPr>
             <w:r>
               <w:rPr>
@@ -1250,20 +962,12 @@
         </w:tc>
         <w:tc>
           <w:tcPr>
-            <w:tcW w:type="dxa" w:w="4025"/>
-            <w:tcBorders>
-              <w:top w:val="single" w:sz="4" w:color="D9D9D9"/>
-              <w:left w:val="single" w:sz="4" w:color="D9D9D9"/>
-              <w:bottom w:val="single" w:sz="4" w:color="D9D9D9"/>
-              <w:right w:val="single" w:sz="4" w:color="D9D9D9"/>
-              <w:insideH w:val="single" w:sz="4" w:color="D9D9D9"/>
-              <w:insideV w:val="single" w:sz="4" w:color="D9D9D9"/>
-            </w:tcBorders>
+            <w:tcW w:type="dxa" w:w="4082"/>
             <w:shd w:fill="F2F5F7"/>
           </w:tcPr>
           <w:p>
             <w:pPr>
-              <w:spacing w:after="80" w:before="80"/>
+              <w:spacing w:before="80" w:after="80"/>
             </w:pPr>
             <w:r>
               <w:rPr>
@@ -1287,6 +991,7 @@
       </w:r>
     </w:p>
     <w:p>
+      <w:pPr/>
       <w:r>
         <w:t>WarehouseProd, FixedBin, WarehouseStock, StockSerial, HandlingUnit, HUContent, PackSpec, PackLevel, PackElement.</w:t>
       </w:r>
@@ -1300,16 +1005,19 @@
       </w:r>
     </w:p>
     <w:p>
+      <w:pPr/>
       <w:r>
         <w:t>Kapazitätssemantik und vollständige operative Bestände fehlen. Bestätigte Aufgaben sind Referenzdaten; Offene Aufgaben und Eingangslieferungen sind enthalten; Mengen, Ausgangslieferungen, Lagerprodukte und vollständige Bestände bleiben offen.</w:t>
       </w:r>
     </w:p>
     <w:p>
+      <w:pPr/>
       <w:r>
         <w:t>Vollständige Feldzuordnung und Quellen: Produkthandbuch, PROVENANCE.md und Native-Coverage.csv.</w:t>
       </w:r>
     </w:p>
     <w:p>
+      <w:pPr/>
       <w:r>
         <w:t>Products: ewm_mig_src and ewm_mig_s4</w:t>
       </w:r>
@@ -1328,6 +1036,7 @@
       </w:r>
     </w:p>
     <w:p>
+      <w:pPr/>
       <w:r>
         <w:t>7 native Entwürfe; 12 offene Strukturen. Alle SAP-Prüfungen stehen aus.</w:t>
       </w:r>
@@ -1339,31 +1048,23 @@
         <w:tblLook w:firstColumn="1" w:firstRow="1" w:lastColumn="0" w:lastRow="0" w:noHBand="0" w:noVBand="1" w:val="04A0"/>
       </w:tblPr>
       <w:tblGrid>
-        <w:gridCol w:w="2381"/>
-        <w:gridCol w:w="3458"/>
-        <w:gridCol w:w="4025"/>
+        <w:gridCol w:w="3289"/>
+        <w:gridCol w:w="3289"/>
+        <w:gridCol w:w="3289"/>
       </w:tblGrid>
       <w:tr>
         <w:trPr>
+          <w:cantSplit/>
           <w:tblHeader/>
-          <w:cantSplit/>
         </w:trPr>
         <w:tc>
           <w:tcPr>
-            <w:tcW w:type="dxa" w:w="2381"/>
-            <w:tcBorders>
-              <w:top w:val="single" w:sz="4" w:color="D9D9D9"/>
-              <w:left w:val="single" w:sz="4" w:color="D9D9D9"/>
-              <w:bottom w:val="single" w:sz="4" w:color="D9D9D9"/>
-              <w:right w:val="single" w:sz="4" w:color="D9D9D9"/>
-              <w:insideH w:val="single" w:sz="4" w:color="D9D9D9"/>
-              <w:insideV w:val="single" w:sz="4" w:color="D9D9D9"/>
-            </w:tcBorders>
+            <w:tcW w:type="dxa" w:w="2324"/>
             <w:shd w:fill="273D50"/>
           </w:tcPr>
           <w:p>
             <w:pPr>
-              <w:spacing w:after="80" w:before="80"/>
+              <w:spacing w:before="80" w:after="80"/>
             </w:pPr>
             <w:r>
               <w:rPr>
@@ -1378,19 +1079,11 @@
         <w:tc>
           <w:tcPr>
             <w:tcW w:type="dxa" w:w="3458"/>
-            <w:tcBorders>
-              <w:top w:val="single" w:sz="4" w:color="D9D9D9"/>
-              <w:left w:val="single" w:sz="4" w:color="D9D9D9"/>
-              <w:bottom w:val="single" w:sz="4" w:color="D9D9D9"/>
-              <w:right w:val="single" w:sz="4" w:color="D9D9D9"/>
-              <w:insideH w:val="single" w:sz="4" w:color="D9D9D9"/>
-              <w:insideV w:val="single" w:sz="4" w:color="D9D9D9"/>
-            </w:tcBorders>
             <w:shd w:fill="273D50"/>
           </w:tcPr>
           <w:p>
             <w:pPr>
-              <w:spacing w:after="80" w:before="80"/>
+              <w:spacing w:before="80" w:after="80"/>
             </w:pPr>
             <w:r>
               <w:rPr>
@@ -1404,20 +1097,12 @@
         </w:tc>
         <w:tc>
           <w:tcPr>
-            <w:tcW w:type="dxa" w:w="4025"/>
-            <w:tcBorders>
-              <w:top w:val="single" w:sz="4" w:color="D9D9D9"/>
-              <w:left w:val="single" w:sz="4" w:color="D9D9D9"/>
-              <w:bottom w:val="single" w:sz="4" w:color="D9D9D9"/>
-              <w:right w:val="single" w:sz="4" w:color="D9D9D9"/>
-              <w:insideH w:val="single" w:sz="4" w:color="D9D9D9"/>
-              <w:insideV w:val="single" w:sz="4" w:color="D9D9D9"/>
-            </w:tcBorders>
+            <w:tcW w:type="dxa" w:w="4082"/>
             <w:shd w:fill="273D50"/>
           </w:tcPr>
           <w:p>
             <w:pPr>
-              <w:spacing w:after="80" w:before="80"/>
+              <w:spacing w:before="80" w:after="80"/>
             </w:pPr>
             <w:r>
               <w:rPr>
@@ -1436,20 +1121,12 @@
         </w:trPr>
         <w:tc>
           <w:tcPr>
-            <w:tcW w:type="dxa" w:w="2381"/>
-            <w:tcBorders>
-              <w:top w:val="single" w:sz="4" w:color="D9D9D9"/>
-              <w:left w:val="single" w:sz="4" w:color="D9D9D9"/>
-              <w:bottom w:val="single" w:sz="4" w:color="D9D9D9"/>
-              <w:right w:val="single" w:sz="4" w:color="D9D9D9"/>
-              <w:insideH w:val="single" w:sz="4" w:color="D9D9D9"/>
-              <w:insideV w:val="single" w:sz="4" w:color="D9D9D9"/>
-            </w:tcBorders>
+            <w:tcW w:type="dxa" w:w="2324"/>
             <w:shd w:fill="F2F5F7"/>
           </w:tcPr>
           <w:p>
             <w:pPr>
-              <w:spacing w:after="80" w:before="80"/>
+              <w:spacing w:before="80" w:after="80"/>
             </w:pPr>
             <w:r>
               <w:rPr>
@@ -1464,19 +1141,11 @@
         <w:tc>
           <w:tcPr>
             <w:tcW w:type="dxa" w:w="3458"/>
-            <w:tcBorders>
-              <w:top w:val="single" w:sz="4" w:color="D9D9D9"/>
-              <w:left w:val="single" w:sz="4" w:color="D9D9D9"/>
-              <w:bottom w:val="single" w:sz="4" w:color="D9D9D9"/>
-              <w:right w:val="single" w:sz="4" w:color="D9D9D9"/>
-              <w:insideH w:val="single" w:sz="4" w:color="D9D9D9"/>
-              <w:insideV w:val="single" w:sz="4" w:color="D9D9D9"/>
-            </w:tcBorders>
             <w:shd w:fill="F2F5F7"/>
           </w:tcPr>
           <w:p>
             <w:pPr>
-              <w:spacing w:after="80" w:before="80"/>
+              <w:spacing w:before="80" w:after="80"/>
             </w:pPr>
             <w:r>
               <w:rPr>
@@ -1490,20 +1159,12 @@
         </w:tc>
         <w:tc>
           <w:tcPr>
-            <w:tcW w:type="dxa" w:w="4025"/>
-            <w:tcBorders>
-              <w:top w:val="single" w:sz="4" w:color="D9D9D9"/>
-              <w:left w:val="single" w:sz="4" w:color="D9D9D9"/>
-              <w:bottom w:val="single" w:sz="4" w:color="D9D9D9"/>
-              <w:right w:val="single" w:sz="4" w:color="D9D9D9"/>
-              <w:insideH w:val="single" w:sz="4" w:color="D9D9D9"/>
-              <w:insideV w:val="single" w:sz="4" w:color="D9D9D9"/>
-            </w:tcBorders>
+            <w:tcW w:type="dxa" w:w="4082"/>
             <w:shd w:fill="F2F5F7"/>
           </w:tcPr>
           <w:p>
             <w:pPr>
-              <w:spacing w:after="80" w:before="80"/>
+              <w:spacing w:before="80" w:after="80"/>
             </w:pPr>
             <w:r>
               <w:rPr>
@@ -1522,20 +1183,12 @@
         </w:trPr>
         <w:tc>
           <w:tcPr>
-            <w:tcW w:type="dxa" w:w="2381"/>
-            <w:tcBorders>
-              <w:top w:val="single" w:sz="4" w:color="D9D9D9"/>
-              <w:left w:val="single" w:sz="4" w:color="D9D9D9"/>
-              <w:bottom w:val="single" w:sz="4" w:color="D9D9D9"/>
-              <w:right w:val="single" w:sz="4" w:color="D9D9D9"/>
-              <w:insideH w:val="single" w:sz="4" w:color="D9D9D9"/>
-              <w:insideV w:val="single" w:sz="4" w:color="D9D9D9"/>
-            </w:tcBorders>
+            <w:tcW w:type="dxa" w:w="2324"/>
             <w:shd w:fill="FFFFFF"/>
           </w:tcPr>
           <w:p>
             <w:pPr>
-              <w:spacing w:after="80" w:before="80"/>
+              <w:spacing w:before="80" w:after="80"/>
             </w:pPr>
             <w:r>
               <w:rPr>
@@ -1550,19 +1203,11 @@
         <w:tc>
           <w:tcPr>
             <w:tcW w:type="dxa" w:w="3458"/>
-            <w:tcBorders>
-              <w:top w:val="single" w:sz="4" w:color="D9D9D9"/>
-              <w:left w:val="single" w:sz="4" w:color="D9D9D9"/>
-              <w:bottom w:val="single" w:sz="4" w:color="D9D9D9"/>
-              <w:right w:val="single" w:sz="4" w:color="D9D9D9"/>
-              <w:insideH w:val="single" w:sz="4" w:color="D9D9D9"/>
-              <w:insideV w:val="single" w:sz="4" w:color="D9D9D9"/>
-            </w:tcBorders>
             <w:shd w:fill="FFFFFF"/>
           </w:tcPr>
           <w:p>
             <w:pPr>
-              <w:spacing w:after="80" w:before="80"/>
+              <w:spacing w:before="80" w:after="80"/>
             </w:pPr>
             <w:r>
               <w:rPr>
@@ -1576,20 +1221,12 @@
         </w:tc>
         <w:tc>
           <w:tcPr>
-            <w:tcW w:type="dxa" w:w="4025"/>
-            <w:tcBorders>
-              <w:top w:val="single" w:sz="4" w:color="D9D9D9"/>
-              <w:left w:val="single" w:sz="4" w:color="D9D9D9"/>
-              <w:bottom w:val="single" w:sz="4" w:color="D9D9D9"/>
-              <w:right w:val="single" w:sz="4" w:color="D9D9D9"/>
-              <w:insideH w:val="single" w:sz="4" w:color="D9D9D9"/>
-              <w:insideV w:val="single" w:sz="4" w:color="D9D9D9"/>
-            </w:tcBorders>
+            <w:tcW w:type="dxa" w:w="4082"/>
             <w:shd w:fill="FFFFFF"/>
           </w:tcPr>
           <w:p>
             <w:pPr>
-              <w:spacing w:after="80" w:before="80"/>
+              <w:spacing w:before="80" w:after="80"/>
             </w:pPr>
             <w:r>
               <w:rPr>
@@ -1608,20 +1245,12 @@
         </w:trPr>
         <w:tc>
           <w:tcPr>
-            <w:tcW w:type="dxa" w:w="2381"/>
-            <w:tcBorders>
-              <w:top w:val="single" w:sz="4" w:color="D9D9D9"/>
-              <w:left w:val="single" w:sz="4" w:color="D9D9D9"/>
-              <w:bottom w:val="single" w:sz="4" w:color="D9D9D9"/>
-              <w:right w:val="single" w:sz="4" w:color="D9D9D9"/>
-              <w:insideH w:val="single" w:sz="4" w:color="D9D9D9"/>
-              <w:insideV w:val="single" w:sz="4" w:color="D9D9D9"/>
-            </w:tcBorders>
+            <w:tcW w:type="dxa" w:w="2324"/>
             <w:shd w:fill="F2F5F7"/>
           </w:tcPr>
           <w:p>
             <w:pPr>
-              <w:spacing w:after="80" w:before="80"/>
+              <w:spacing w:before="80" w:after="80"/>
             </w:pPr>
             <w:r>
               <w:rPr>
@@ -1636,19 +1265,11 @@
         <w:tc>
           <w:tcPr>
             <w:tcW w:type="dxa" w:w="3458"/>
-            <w:tcBorders>
-              <w:top w:val="single" w:sz="4" w:color="D9D9D9"/>
-              <w:left w:val="single" w:sz="4" w:color="D9D9D9"/>
-              <w:bottom w:val="single" w:sz="4" w:color="D9D9D9"/>
-              <w:right w:val="single" w:sz="4" w:color="D9D9D9"/>
-              <w:insideH w:val="single" w:sz="4" w:color="D9D9D9"/>
-              <w:insideV w:val="single" w:sz="4" w:color="D9D9D9"/>
-            </w:tcBorders>
             <w:shd w:fill="F2F5F7"/>
           </w:tcPr>
           <w:p>
             <w:pPr>
-              <w:spacing w:after="80" w:before="80"/>
+              <w:spacing w:before="80" w:after="80"/>
             </w:pPr>
             <w:r>
               <w:rPr>
@@ -1662,20 +1283,12 @@
         </w:tc>
         <w:tc>
           <w:tcPr>
-            <w:tcW w:type="dxa" w:w="4025"/>
-            <w:tcBorders>
-              <w:top w:val="single" w:sz="4" w:color="D9D9D9"/>
-              <w:left w:val="single" w:sz="4" w:color="D9D9D9"/>
-              <w:bottom w:val="single" w:sz="4" w:color="D9D9D9"/>
-              <w:right w:val="single" w:sz="4" w:color="D9D9D9"/>
-              <w:insideH w:val="single" w:sz="4" w:color="D9D9D9"/>
-              <w:insideV w:val="single" w:sz="4" w:color="D9D9D9"/>
-            </w:tcBorders>
+            <w:tcW w:type="dxa" w:w="4082"/>
             <w:shd w:fill="F2F5F7"/>
           </w:tcPr>
           <w:p>
             <w:pPr>
-              <w:spacing w:after="80" w:before="80"/>
+              <w:spacing w:before="80" w:after="80"/>
             </w:pPr>
             <w:r>
               <w:rPr>
@@ -1694,20 +1307,12 @@
         </w:trPr>
         <w:tc>
           <w:tcPr>
-            <w:tcW w:type="dxa" w:w="2381"/>
-            <w:tcBorders>
-              <w:top w:val="single" w:sz="4" w:color="D9D9D9"/>
-              <w:left w:val="single" w:sz="4" w:color="D9D9D9"/>
-              <w:bottom w:val="single" w:sz="4" w:color="D9D9D9"/>
-              <w:right w:val="single" w:sz="4" w:color="D9D9D9"/>
-              <w:insideH w:val="single" w:sz="4" w:color="D9D9D9"/>
-              <w:insideV w:val="single" w:sz="4" w:color="D9D9D9"/>
-            </w:tcBorders>
+            <w:tcW w:type="dxa" w:w="2324"/>
             <w:shd w:fill="FFFFFF"/>
           </w:tcPr>
           <w:p>
             <w:pPr>
-              <w:spacing w:after="80" w:before="80"/>
+              <w:spacing w:before="80" w:after="80"/>
             </w:pPr>
             <w:r>
               <w:rPr>
@@ -1722,19 +1327,11 @@
         <w:tc>
           <w:tcPr>
             <w:tcW w:type="dxa" w:w="3458"/>
-            <w:tcBorders>
-              <w:top w:val="single" w:sz="4" w:color="D9D9D9"/>
-              <w:left w:val="single" w:sz="4" w:color="D9D9D9"/>
-              <w:bottom w:val="single" w:sz="4" w:color="D9D9D9"/>
-              <w:right w:val="single" w:sz="4" w:color="D9D9D9"/>
-              <w:insideH w:val="single" w:sz="4" w:color="D9D9D9"/>
-              <w:insideV w:val="single" w:sz="4" w:color="D9D9D9"/>
-            </w:tcBorders>
             <w:shd w:fill="FFFFFF"/>
           </w:tcPr>
           <w:p>
             <w:pPr>
-              <w:spacing w:after="80" w:before="80"/>
+              <w:spacing w:before="80" w:after="80"/>
             </w:pPr>
             <w:r>
               <w:rPr>
@@ -1748,20 +1345,12 @@
         </w:tc>
         <w:tc>
           <w:tcPr>
-            <w:tcW w:type="dxa" w:w="4025"/>
-            <w:tcBorders>
-              <w:top w:val="single" w:sz="4" w:color="D9D9D9"/>
-              <w:left w:val="single" w:sz="4" w:color="D9D9D9"/>
-              <w:bottom w:val="single" w:sz="4" w:color="D9D9D9"/>
-              <w:right w:val="single" w:sz="4" w:color="D9D9D9"/>
-              <w:insideH w:val="single" w:sz="4" w:color="D9D9D9"/>
-              <w:insideV w:val="single" w:sz="4" w:color="D9D9D9"/>
-            </w:tcBorders>
+            <w:tcW w:type="dxa" w:w="4082"/>
             <w:shd w:fill="FFFFFF"/>
           </w:tcPr>
           <w:p>
             <w:pPr>
-              <w:spacing w:after="80" w:before="80"/>
+              <w:spacing w:before="80" w:after="80"/>
             </w:pPr>
             <w:r>
               <w:rPr>
@@ -1780,20 +1369,12 @@
         </w:trPr>
         <w:tc>
           <w:tcPr>
-            <w:tcW w:type="dxa" w:w="2381"/>
-            <w:tcBorders>
-              <w:top w:val="single" w:sz="4" w:color="D9D9D9"/>
-              <w:left w:val="single" w:sz="4" w:color="D9D9D9"/>
-              <w:bottom w:val="single" w:sz="4" w:color="D9D9D9"/>
-              <w:right w:val="single" w:sz="4" w:color="D9D9D9"/>
-              <w:insideH w:val="single" w:sz="4" w:color="D9D9D9"/>
-              <w:insideV w:val="single" w:sz="4" w:color="D9D9D9"/>
-            </w:tcBorders>
+            <w:tcW w:type="dxa" w:w="2324"/>
             <w:shd w:fill="F2F5F7"/>
           </w:tcPr>
           <w:p>
             <w:pPr>
-              <w:spacing w:after="80" w:before="80"/>
+              <w:spacing w:before="80" w:after="80"/>
             </w:pPr>
             <w:r>
               <w:rPr>
@@ -1808,19 +1389,11 @@
         <w:tc>
           <w:tcPr>
             <w:tcW w:type="dxa" w:w="3458"/>
-            <w:tcBorders>
-              <w:top w:val="single" w:sz="4" w:color="D9D9D9"/>
-              <w:left w:val="single" w:sz="4" w:color="D9D9D9"/>
-              <w:bottom w:val="single" w:sz="4" w:color="D9D9D9"/>
-              <w:right w:val="single" w:sz="4" w:color="D9D9D9"/>
-              <w:insideH w:val="single" w:sz="4" w:color="D9D9D9"/>
-              <w:insideV w:val="single" w:sz="4" w:color="D9D9D9"/>
-            </w:tcBorders>
             <w:shd w:fill="F2F5F7"/>
           </w:tcPr>
           <w:p>
             <w:pPr>
-              <w:spacing w:after="80" w:before="80"/>
+              <w:spacing w:before="80" w:after="80"/>
             </w:pPr>
             <w:r>
               <w:rPr>
@@ -1834,20 +1407,12 @@
         </w:tc>
         <w:tc>
           <w:tcPr>
-            <w:tcW w:type="dxa" w:w="4025"/>
-            <w:tcBorders>
-              <w:top w:val="single" w:sz="4" w:color="D9D9D9"/>
-              <w:left w:val="single" w:sz="4" w:color="D9D9D9"/>
-              <w:bottom w:val="single" w:sz="4" w:color="D9D9D9"/>
-              <w:right w:val="single" w:sz="4" w:color="D9D9D9"/>
-              <w:insideH w:val="single" w:sz="4" w:color="D9D9D9"/>
-              <w:insideV w:val="single" w:sz="4" w:color="D9D9D9"/>
-            </w:tcBorders>
+            <w:tcW w:type="dxa" w:w="4082"/>
             <w:shd w:fill="F2F5F7"/>
           </w:tcPr>
           <w:p>
             <w:pPr>
-              <w:spacing w:after="80" w:before="80"/>
+              <w:spacing w:before="80" w:after="80"/>
             </w:pPr>
             <w:r>
               <w:rPr>
@@ -1866,20 +1431,12 @@
         </w:trPr>
         <w:tc>
           <w:tcPr>
-            <w:tcW w:type="dxa" w:w="2381"/>
-            <w:tcBorders>
-              <w:top w:val="single" w:sz="4" w:color="D9D9D9"/>
-              <w:left w:val="single" w:sz="4" w:color="D9D9D9"/>
-              <w:bottom w:val="single" w:sz="4" w:color="D9D9D9"/>
-              <w:right w:val="single" w:sz="4" w:color="D9D9D9"/>
-              <w:insideH w:val="single" w:sz="4" w:color="D9D9D9"/>
-              <w:insideV w:val="single" w:sz="4" w:color="D9D9D9"/>
-            </w:tcBorders>
+            <w:tcW w:type="dxa" w:w="2324"/>
             <w:shd w:fill="FFFFFF"/>
           </w:tcPr>
           <w:p>
             <w:pPr>
-              <w:spacing w:after="80" w:before="80"/>
+              <w:spacing w:before="80" w:after="80"/>
             </w:pPr>
             <w:r>
               <w:rPr>
@@ -1894,19 +1451,11 @@
         <w:tc>
           <w:tcPr>
             <w:tcW w:type="dxa" w:w="3458"/>
-            <w:tcBorders>
-              <w:top w:val="single" w:sz="4" w:color="D9D9D9"/>
-              <w:left w:val="single" w:sz="4" w:color="D9D9D9"/>
-              <w:bottom w:val="single" w:sz="4" w:color="D9D9D9"/>
-              <w:right w:val="single" w:sz="4" w:color="D9D9D9"/>
-              <w:insideH w:val="single" w:sz="4" w:color="D9D9D9"/>
-              <w:insideV w:val="single" w:sz="4" w:color="D9D9D9"/>
-            </w:tcBorders>
             <w:shd w:fill="FFFFFF"/>
           </w:tcPr>
           <w:p>
             <w:pPr>
-              <w:spacing w:after="80" w:before="80"/>
+              <w:spacing w:before="80" w:after="80"/>
             </w:pPr>
             <w:r>
               <w:rPr>
@@ -1920,20 +1469,12 @@
         </w:tc>
         <w:tc>
           <w:tcPr>
-            <w:tcW w:type="dxa" w:w="4025"/>
-            <w:tcBorders>
-              <w:top w:val="single" w:sz="4" w:color="D9D9D9"/>
-              <w:left w:val="single" w:sz="4" w:color="D9D9D9"/>
-              <w:bottom w:val="single" w:sz="4" w:color="D9D9D9"/>
-              <w:right w:val="single" w:sz="4" w:color="D9D9D9"/>
-              <w:insideH w:val="single" w:sz="4" w:color="D9D9D9"/>
-              <w:insideV w:val="single" w:sz="4" w:color="D9D9D9"/>
-            </w:tcBorders>
+            <w:tcW w:type="dxa" w:w="4082"/>
             <w:shd w:fill="FFFFFF"/>
           </w:tcPr>
           <w:p>
             <w:pPr>
-              <w:spacing w:after="80" w:before="80"/>
+              <w:spacing w:before="80" w:after="80"/>
             </w:pPr>
             <w:r>
               <w:rPr>
@@ -1952,20 +1493,12 @@
         </w:trPr>
         <w:tc>
           <w:tcPr>
-            <w:tcW w:type="dxa" w:w="2381"/>
-            <w:tcBorders>
-              <w:top w:val="single" w:sz="4" w:color="D9D9D9"/>
-              <w:left w:val="single" w:sz="4" w:color="D9D9D9"/>
-              <w:bottom w:val="single" w:sz="4" w:color="D9D9D9"/>
-              <w:right w:val="single" w:sz="4" w:color="D9D9D9"/>
-              <w:insideH w:val="single" w:sz="4" w:color="D9D9D9"/>
-              <w:insideV w:val="single" w:sz="4" w:color="D9D9D9"/>
-            </w:tcBorders>
+            <w:tcW w:type="dxa" w:w="2324"/>
             <w:shd w:fill="F2F5F7"/>
           </w:tcPr>
           <w:p>
             <w:pPr>
-              <w:spacing w:after="80" w:before="80"/>
+              <w:spacing w:before="80" w:after="80"/>
             </w:pPr>
             <w:r>
               <w:rPr>
@@ -1980,19 +1513,11 @@
         <w:tc>
           <w:tcPr>
             <w:tcW w:type="dxa" w:w="3458"/>
-            <w:tcBorders>
-              <w:top w:val="single" w:sz="4" w:color="D9D9D9"/>
-              <w:left w:val="single" w:sz="4" w:color="D9D9D9"/>
-              <w:bottom w:val="single" w:sz="4" w:color="D9D9D9"/>
-              <w:right w:val="single" w:sz="4" w:color="D9D9D9"/>
-              <w:insideH w:val="single" w:sz="4" w:color="D9D9D9"/>
-              <w:insideV w:val="single" w:sz="4" w:color="D9D9D9"/>
-            </w:tcBorders>
             <w:shd w:fill="F2F5F7"/>
           </w:tcPr>
           <w:p>
             <w:pPr>
-              <w:spacing w:after="80" w:before="80"/>
+              <w:spacing w:before="80" w:after="80"/>
             </w:pPr>
             <w:r>
               <w:rPr>
@@ -2006,20 +1531,12 @@
         </w:tc>
         <w:tc>
           <w:tcPr>
-            <w:tcW w:type="dxa" w:w="4025"/>
-            <w:tcBorders>
-              <w:top w:val="single" w:sz="4" w:color="D9D9D9"/>
-              <w:left w:val="single" w:sz="4" w:color="D9D9D9"/>
-              <w:bottom w:val="single" w:sz="4" w:color="D9D9D9"/>
-              <w:right w:val="single" w:sz="4" w:color="D9D9D9"/>
-              <w:insideH w:val="single" w:sz="4" w:color="D9D9D9"/>
-              <w:insideV w:val="single" w:sz="4" w:color="D9D9D9"/>
-            </w:tcBorders>
+            <w:tcW w:type="dxa" w:w="4082"/>
             <w:shd w:fill="F2F5F7"/>
           </w:tcPr>
           <w:p>
             <w:pPr>
-              <w:spacing w:after="80" w:before="80"/>
+              <w:spacing w:before="80" w:after="80"/>
             </w:pPr>
             <w:r>
               <w:rPr>
@@ -2043,6 +1560,7 @@
       </w:r>
     </w:p>
     <w:p>
+      <w:pPr/>
       <w:r>
         <w:t>TransportRes, ResCapacity, TransportLane, LaneCarrier, Schedule, ScheduleStop, FreightAgree, FreightRate, FreightScale, FreightStage, FreightSettle, SettleItem.</w:t>
       </w:r>
@@ -2056,16 +1574,19 @@
       </w:r>
     </w:p>
     <w:p>
+      <w:pPr/>
       <w:r>
         <w:t>Wurzelviews liefern keine vollständigen Frachteinheiten oder Frachtaufträge. Positionen und Stopps sind nach Kategorie gefilterte native Entwürfe. Routenfolge, Etappen, Mengen und Buchungen bleiben offen. UUIDs und Kategorien prüfen.</w:t>
       </w:r>
     </w:p>
     <w:p>
+      <w:pPr/>
       <w:r>
         <w:t>Vollständige Feldzuordnung und Quellen: Produkthandbuch, PROVENANCE.md und Native-Coverage.csv.</w:t>
       </w:r>
     </w:p>
     <w:p>
+      <w:pPr/>
       <w:r>
         <w:t>Products: tm_mig_src and tm_mig_s4</w:t>
       </w:r>
@@ -2084,6 +1605,7 @@
       </w:r>
     </w:p>
     <w:p>
+      <w:pPr/>
       <w:r>
         <w:t>7 native Entwürfe; 7 offene Strukturen. Alle SAP-Prüfungen stehen aus.</w:t>
       </w:r>
@@ -2095,31 +1617,23 @@
         <w:tblLook w:firstColumn="1" w:firstRow="1" w:lastColumn="0" w:lastRow="0" w:noHBand="0" w:noVBand="1" w:val="04A0"/>
       </w:tblPr>
       <w:tblGrid>
-        <w:gridCol w:w="2381"/>
-        <w:gridCol w:w="3458"/>
-        <w:gridCol w:w="4025"/>
+        <w:gridCol w:w="3289"/>
+        <w:gridCol w:w="3289"/>
+        <w:gridCol w:w="3289"/>
       </w:tblGrid>
       <w:tr>
         <w:trPr>
+          <w:cantSplit/>
           <w:tblHeader/>
-          <w:cantSplit/>
         </w:trPr>
         <w:tc>
           <w:tcPr>
-            <w:tcW w:type="dxa" w:w="2381"/>
-            <w:tcBorders>
-              <w:top w:val="single" w:sz="4" w:color="D9D9D9"/>
-              <w:left w:val="single" w:sz="4" w:color="D9D9D9"/>
-              <w:bottom w:val="single" w:sz="4" w:color="D9D9D9"/>
-              <w:right w:val="single" w:sz="4" w:color="D9D9D9"/>
-              <w:insideH w:val="single" w:sz="4" w:color="D9D9D9"/>
-              <w:insideV w:val="single" w:sz="4" w:color="D9D9D9"/>
-            </w:tcBorders>
+            <w:tcW w:type="dxa" w:w="2324"/>
             <w:shd w:fill="273D50"/>
           </w:tcPr>
           <w:p>
             <w:pPr>
-              <w:spacing w:after="80" w:before="80"/>
+              <w:spacing w:before="80" w:after="80"/>
             </w:pPr>
             <w:r>
               <w:rPr>
@@ -2134,19 +1648,11 @@
         <w:tc>
           <w:tcPr>
             <w:tcW w:type="dxa" w:w="3458"/>
-            <w:tcBorders>
-              <w:top w:val="single" w:sz="4" w:color="D9D9D9"/>
-              <w:left w:val="single" w:sz="4" w:color="D9D9D9"/>
-              <w:bottom w:val="single" w:sz="4" w:color="D9D9D9"/>
-              <w:right w:val="single" w:sz="4" w:color="D9D9D9"/>
-              <w:insideH w:val="single" w:sz="4" w:color="D9D9D9"/>
-              <w:insideV w:val="single" w:sz="4" w:color="D9D9D9"/>
-            </w:tcBorders>
             <w:shd w:fill="273D50"/>
           </w:tcPr>
           <w:p>
             <w:pPr>
-              <w:spacing w:after="80" w:before="80"/>
+              <w:spacing w:before="80" w:after="80"/>
             </w:pPr>
             <w:r>
               <w:rPr>
@@ -2160,20 +1666,12 @@
         </w:tc>
         <w:tc>
           <w:tcPr>
-            <w:tcW w:type="dxa" w:w="4025"/>
-            <w:tcBorders>
-              <w:top w:val="single" w:sz="4" w:color="D9D9D9"/>
-              <w:left w:val="single" w:sz="4" w:color="D9D9D9"/>
-              <w:bottom w:val="single" w:sz="4" w:color="D9D9D9"/>
-              <w:right w:val="single" w:sz="4" w:color="D9D9D9"/>
-              <w:insideH w:val="single" w:sz="4" w:color="D9D9D9"/>
-              <w:insideV w:val="single" w:sz="4" w:color="D9D9D9"/>
-            </w:tcBorders>
+            <w:tcW w:type="dxa" w:w="4082"/>
             <w:shd w:fill="273D50"/>
           </w:tcPr>
           <w:p>
             <w:pPr>
-              <w:spacing w:after="80" w:before="80"/>
+              <w:spacing w:before="80" w:after="80"/>
             </w:pPr>
             <w:r>
               <w:rPr>
@@ -2192,20 +1690,12 @@
         </w:trPr>
         <w:tc>
           <w:tcPr>
-            <w:tcW w:type="dxa" w:w="2381"/>
-            <w:tcBorders>
-              <w:top w:val="single" w:sz="4" w:color="D9D9D9"/>
-              <w:left w:val="single" w:sz="4" w:color="D9D9D9"/>
-              <w:bottom w:val="single" w:sz="4" w:color="D9D9D9"/>
-              <w:right w:val="single" w:sz="4" w:color="D9D9D9"/>
-              <w:insideH w:val="single" w:sz="4" w:color="D9D9D9"/>
-              <w:insideV w:val="single" w:sz="4" w:color="D9D9D9"/>
-            </w:tcBorders>
+            <w:tcW w:type="dxa" w:w="2324"/>
             <w:shd w:fill="F2F5F7"/>
           </w:tcPr>
           <w:p>
             <w:pPr>
-              <w:spacing w:after="80" w:before="80"/>
+              <w:spacing w:before="80" w:after="80"/>
             </w:pPr>
             <w:r>
               <w:rPr>
@@ -2220,19 +1710,11 @@
         <w:tc>
           <w:tcPr>
             <w:tcW w:type="dxa" w:w="3458"/>
-            <w:tcBorders>
-              <w:top w:val="single" w:sz="4" w:color="D9D9D9"/>
-              <w:left w:val="single" w:sz="4" w:color="D9D9D9"/>
-              <w:bottom w:val="single" w:sz="4" w:color="D9D9D9"/>
-              <w:right w:val="single" w:sz="4" w:color="D9D9D9"/>
-              <w:insideH w:val="single" w:sz="4" w:color="D9D9D9"/>
-              <w:insideV w:val="single" w:sz="4" w:color="D9D9D9"/>
-            </w:tcBorders>
             <w:shd w:fill="F2F5F7"/>
           </w:tcPr>
           <w:p>
             <w:pPr>
-              <w:spacing w:after="80" w:before="80"/>
+              <w:spacing w:before="80" w:after="80"/>
             </w:pPr>
             <w:r>
               <w:rPr>
@@ -2246,20 +1728,12 @@
         </w:tc>
         <w:tc>
           <w:tcPr>
-            <w:tcW w:type="dxa" w:w="4025"/>
-            <w:tcBorders>
-              <w:top w:val="single" w:sz="4" w:color="D9D9D9"/>
-              <w:left w:val="single" w:sz="4" w:color="D9D9D9"/>
-              <w:bottom w:val="single" w:sz="4" w:color="D9D9D9"/>
-              <w:right w:val="single" w:sz="4" w:color="D9D9D9"/>
-              <w:insideH w:val="single" w:sz="4" w:color="D9D9D9"/>
-              <w:insideV w:val="single" w:sz="4" w:color="D9D9D9"/>
-            </w:tcBorders>
+            <w:tcW w:type="dxa" w:w="4082"/>
             <w:shd w:fill="F2F5F7"/>
           </w:tcPr>
           <w:p>
             <w:pPr>
-              <w:spacing w:after="80" w:before="80"/>
+              <w:spacing w:before="80" w:after="80"/>
             </w:pPr>
             <w:r>
               <w:rPr>
@@ -2278,20 +1752,12 @@
         </w:trPr>
         <w:tc>
           <w:tcPr>
-            <w:tcW w:type="dxa" w:w="2381"/>
-            <w:tcBorders>
-              <w:top w:val="single" w:sz="4" w:color="D9D9D9"/>
-              <w:left w:val="single" w:sz="4" w:color="D9D9D9"/>
-              <w:bottom w:val="single" w:sz="4" w:color="D9D9D9"/>
-              <w:right w:val="single" w:sz="4" w:color="D9D9D9"/>
-              <w:insideH w:val="single" w:sz="4" w:color="D9D9D9"/>
-              <w:insideV w:val="single" w:sz="4" w:color="D9D9D9"/>
-            </w:tcBorders>
+            <w:tcW w:type="dxa" w:w="2324"/>
             <w:shd w:fill="FFFFFF"/>
           </w:tcPr>
           <w:p>
             <w:pPr>
-              <w:spacing w:after="80" w:before="80"/>
+              <w:spacing w:before="80" w:after="80"/>
             </w:pPr>
             <w:r>
               <w:rPr>
@@ -2306,19 +1772,11 @@
         <w:tc>
           <w:tcPr>
             <w:tcW w:type="dxa" w:w="3458"/>
-            <w:tcBorders>
-              <w:top w:val="single" w:sz="4" w:color="D9D9D9"/>
-              <w:left w:val="single" w:sz="4" w:color="D9D9D9"/>
-              <w:bottom w:val="single" w:sz="4" w:color="D9D9D9"/>
-              <w:right w:val="single" w:sz="4" w:color="D9D9D9"/>
-              <w:insideH w:val="single" w:sz="4" w:color="D9D9D9"/>
-              <w:insideV w:val="single" w:sz="4" w:color="D9D9D9"/>
-            </w:tcBorders>
             <w:shd w:fill="FFFFFF"/>
           </w:tcPr>
           <w:p>
             <w:pPr>
-              <w:spacing w:after="80" w:before="80"/>
+              <w:spacing w:before="80" w:after="80"/>
             </w:pPr>
             <w:r>
               <w:rPr>
@@ -2332,20 +1790,12 @@
         </w:tc>
         <w:tc>
           <w:tcPr>
-            <w:tcW w:type="dxa" w:w="4025"/>
-            <w:tcBorders>
-              <w:top w:val="single" w:sz="4" w:color="D9D9D9"/>
-              <w:left w:val="single" w:sz="4" w:color="D9D9D9"/>
-              <w:bottom w:val="single" w:sz="4" w:color="D9D9D9"/>
-              <w:right w:val="single" w:sz="4" w:color="D9D9D9"/>
-              <w:insideH w:val="single" w:sz="4" w:color="D9D9D9"/>
-              <w:insideV w:val="single" w:sz="4" w:color="D9D9D9"/>
-            </w:tcBorders>
+            <w:tcW w:type="dxa" w:w="4082"/>
             <w:shd w:fill="FFFFFF"/>
           </w:tcPr>
           <w:p>
             <w:pPr>
-              <w:spacing w:after="80" w:before="80"/>
+              <w:spacing w:before="80" w:after="80"/>
             </w:pPr>
             <w:r>
               <w:rPr>
@@ -2364,20 +1814,12 @@
         </w:trPr>
         <w:tc>
           <w:tcPr>
-            <w:tcW w:type="dxa" w:w="2381"/>
-            <w:tcBorders>
-              <w:top w:val="single" w:sz="4" w:color="D9D9D9"/>
-              <w:left w:val="single" w:sz="4" w:color="D9D9D9"/>
-              <w:bottom w:val="single" w:sz="4" w:color="D9D9D9"/>
-              <w:right w:val="single" w:sz="4" w:color="D9D9D9"/>
-              <w:insideH w:val="single" w:sz="4" w:color="D9D9D9"/>
-              <w:insideV w:val="single" w:sz="4" w:color="D9D9D9"/>
-            </w:tcBorders>
+            <w:tcW w:type="dxa" w:w="2324"/>
             <w:shd w:fill="F2F5F7"/>
           </w:tcPr>
           <w:p>
             <w:pPr>
-              <w:spacing w:after="80" w:before="80"/>
+              <w:spacing w:before="80" w:after="80"/>
             </w:pPr>
             <w:r>
               <w:rPr>
@@ -2392,19 +1834,11 @@
         <w:tc>
           <w:tcPr>
             <w:tcW w:type="dxa" w:w="3458"/>
-            <w:tcBorders>
-              <w:top w:val="single" w:sz="4" w:color="D9D9D9"/>
-              <w:left w:val="single" w:sz="4" w:color="D9D9D9"/>
-              <w:bottom w:val="single" w:sz="4" w:color="D9D9D9"/>
-              <w:right w:val="single" w:sz="4" w:color="D9D9D9"/>
-              <w:insideH w:val="single" w:sz="4" w:color="D9D9D9"/>
-              <w:insideV w:val="single" w:sz="4" w:color="D9D9D9"/>
-            </w:tcBorders>
             <w:shd w:fill="F2F5F7"/>
           </w:tcPr>
           <w:p>
             <w:pPr>
-              <w:spacing w:after="80" w:before="80"/>
+              <w:spacing w:before="80" w:after="80"/>
             </w:pPr>
             <w:r>
               <w:rPr>
@@ -2418,20 +1852,12 @@
         </w:tc>
         <w:tc>
           <w:tcPr>
-            <w:tcW w:type="dxa" w:w="4025"/>
-            <w:tcBorders>
-              <w:top w:val="single" w:sz="4" w:color="D9D9D9"/>
-              <w:left w:val="single" w:sz="4" w:color="D9D9D9"/>
-              <w:bottom w:val="single" w:sz="4" w:color="D9D9D9"/>
-              <w:right w:val="single" w:sz="4" w:color="D9D9D9"/>
-              <w:insideH w:val="single" w:sz="4" w:color="D9D9D9"/>
-              <w:insideV w:val="single" w:sz="4" w:color="D9D9D9"/>
-            </w:tcBorders>
+            <w:tcW w:type="dxa" w:w="4082"/>
             <w:shd w:fill="F2F5F7"/>
           </w:tcPr>
           <w:p>
             <w:pPr>
-              <w:spacing w:after="80" w:before="80"/>
+              <w:spacing w:before="80" w:after="80"/>
             </w:pPr>
             <w:r>
               <w:rPr>
@@ -2450,20 +1876,12 @@
         </w:trPr>
         <w:tc>
           <w:tcPr>
-            <w:tcW w:type="dxa" w:w="2381"/>
-            <w:tcBorders>
-              <w:top w:val="single" w:sz="4" w:color="D9D9D9"/>
-              <w:left w:val="single" w:sz="4" w:color="D9D9D9"/>
-              <w:bottom w:val="single" w:sz="4" w:color="D9D9D9"/>
-              <w:right w:val="single" w:sz="4" w:color="D9D9D9"/>
-              <w:insideH w:val="single" w:sz="4" w:color="D9D9D9"/>
-              <w:insideV w:val="single" w:sz="4" w:color="D9D9D9"/>
-            </w:tcBorders>
+            <w:tcW w:type="dxa" w:w="2324"/>
             <w:shd w:fill="FFFFFF"/>
           </w:tcPr>
           <w:p>
             <w:pPr>
-              <w:spacing w:after="80" w:before="80"/>
+              <w:spacing w:before="80" w:after="80"/>
             </w:pPr>
             <w:r>
               <w:rPr>
@@ -2478,19 +1896,11 @@
         <w:tc>
           <w:tcPr>
             <w:tcW w:type="dxa" w:w="3458"/>
-            <w:tcBorders>
-              <w:top w:val="single" w:sz="4" w:color="D9D9D9"/>
-              <w:left w:val="single" w:sz="4" w:color="D9D9D9"/>
-              <w:bottom w:val="single" w:sz="4" w:color="D9D9D9"/>
-              <w:right w:val="single" w:sz="4" w:color="D9D9D9"/>
-              <w:insideH w:val="single" w:sz="4" w:color="D9D9D9"/>
-              <w:insideV w:val="single" w:sz="4" w:color="D9D9D9"/>
-            </w:tcBorders>
             <w:shd w:fill="FFFFFF"/>
           </w:tcPr>
           <w:p>
             <w:pPr>
-              <w:spacing w:after="80" w:before="80"/>
+              <w:spacing w:before="80" w:after="80"/>
             </w:pPr>
             <w:r>
               <w:rPr>
@@ -2504,20 +1914,12 @@
         </w:tc>
         <w:tc>
           <w:tcPr>
-            <w:tcW w:type="dxa" w:w="4025"/>
-            <w:tcBorders>
-              <w:top w:val="single" w:sz="4" w:color="D9D9D9"/>
-              <w:left w:val="single" w:sz="4" w:color="D9D9D9"/>
-              <w:bottom w:val="single" w:sz="4" w:color="D9D9D9"/>
-              <w:right w:val="single" w:sz="4" w:color="D9D9D9"/>
-              <w:insideH w:val="single" w:sz="4" w:color="D9D9D9"/>
-              <w:insideV w:val="single" w:sz="4" w:color="D9D9D9"/>
-            </w:tcBorders>
+            <w:tcW w:type="dxa" w:w="4082"/>
             <w:shd w:fill="FFFFFF"/>
           </w:tcPr>
           <w:p>
             <w:pPr>
-              <w:spacing w:after="80" w:before="80"/>
+              <w:spacing w:before="80" w:after="80"/>
             </w:pPr>
             <w:r>
               <w:rPr>
@@ -2536,20 +1938,12 @@
         </w:trPr>
         <w:tc>
           <w:tcPr>
-            <w:tcW w:type="dxa" w:w="2381"/>
-            <w:tcBorders>
-              <w:top w:val="single" w:sz="4" w:color="D9D9D9"/>
-              <w:left w:val="single" w:sz="4" w:color="D9D9D9"/>
-              <w:bottom w:val="single" w:sz="4" w:color="D9D9D9"/>
-              <w:right w:val="single" w:sz="4" w:color="D9D9D9"/>
-              <w:insideH w:val="single" w:sz="4" w:color="D9D9D9"/>
-              <w:insideV w:val="single" w:sz="4" w:color="D9D9D9"/>
-            </w:tcBorders>
+            <w:tcW w:type="dxa" w:w="2324"/>
             <w:shd w:fill="F2F5F7"/>
           </w:tcPr>
           <w:p>
             <w:pPr>
-              <w:spacing w:after="80" w:before="80"/>
+              <w:spacing w:before="80" w:after="80"/>
             </w:pPr>
             <w:r>
               <w:rPr>
@@ -2564,19 +1958,11 @@
         <w:tc>
           <w:tcPr>
             <w:tcW w:type="dxa" w:w="3458"/>
-            <w:tcBorders>
-              <w:top w:val="single" w:sz="4" w:color="D9D9D9"/>
-              <w:left w:val="single" w:sz="4" w:color="D9D9D9"/>
-              <w:bottom w:val="single" w:sz="4" w:color="D9D9D9"/>
-              <w:right w:val="single" w:sz="4" w:color="D9D9D9"/>
-              <w:insideH w:val="single" w:sz="4" w:color="D9D9D9"/>
-              <w:insideV w:val="single" w:sz="4" w:color="D9D9D9"/>
-            </w:tcBorders>
             <w:shd w:fill="F2F5F7"/>
           </w:tcPr>
           <w:p>
             <w:pPr>
-              <w:spacing w:after="80" w:before="80"/>
+              <w:spacing w:before="80" w:after="80"/>
             </w:pPr>
             <w:r>
               <w:rPr>
@@ -2590,20 +1976,12 @@
         </w:tc>
         <w:tc>
           <w:tcPr>
-            <w:tcW w:type="dxa" w:w="4025"/>
-            <w:tcBorders>
-              <w:top w:val="single" w:sz="4" w:color="D9D9D9"/>
-              <w:left w:val="single" w:sz="4" w:color="D9D9D9"/>
-              <w:bottom w:val="single" w:sz="4" w:color="D9D9D9"/>
-              <w:right w:val="single" w:sz="4" w:color="D9D9D9"/>
-              <w:insideH w:val="single" w:sz="4" w:color="D9D9D9"/>
-              <w:insideV w:val="single" w:sz="4" w:color="D9D9D9"/>
-            </w:tcBorders>
+            <w:tcW w:type="dxa" w:w="4082"/>
             <w:shd w:fill="F2F5F7"/>
           </w:tcPr>
           <w:p>
             <w:pPr>
-              <w:spacing w:after="80" w:before="80"/>
+              <w:spacing w:before="80" w:after="80"/>
             </w:pPr>
             <w:r>
               <w:rPr>
@@ -2622,20 +2000,12 @@
         </w:trPr>
         <w:tc>
           <w:tcPr>
-            <w:tcW w:type="dxa" w:w="2381"/>
-            <w:tcBorders>
-              <w:top w:val="single" w:sz="4" w:color="D9D9D9"/>
-              <w:left w:val="single" w:sz="4" w:color="D9D9D9"/>
-              <w:bottom w:val="single" w:sz="4" w:color="D9D9D9"/>
-              <w:right w:val="single" w:sz="4" w:color="D9D9D9"/>
-              <w:insideH w:val="single" w:sz="4" w:color="D9D9D9"/>
-              <w:insideV w:val="single" w:sz="4" w:color="D9D9D9"/>
-            </w:tcBorders>
+            <w:tcW w:type="dxa" w:w="2324"/>
             <w:shd w:fill="FFFFFF"/>
           </w:tcPr>
           <w:p>
             <w:pPr>
-              <w:spacing w:after="80" w:before="80"/>
+              <w:spacing w:before="80" w:after="80"/>
             </w:pPr>
             <w:r>
               <w:rPr>
@@ -2650,19 +2020,11 @@
         <w:tc>
           <w:tcPr>
             <w:tcW w:type="dxa" w:w="3458"/>
-            <w:tcBorders>
-              <w:top w:val="single" w:sz="4" w:color="D9D9D9"/>
-              <w:left w:val="single" w:sz="4" w:color="D9D9D9"/>
-              <w:bottom w:val="single" w:sz="4" w:color="D9D9D9"/>
-              <w:right w:val="single" w:sz="4" w:color="D9D9D9"/>
-              <w:insideH w:val="single" w:sz="4" w:color="D9D9D9"/>
-              <w:insideV w:val="single" w:sz="4" w:color="D9D9D9"/>
-            </w:tcBorders>
             <w:shd w:fill="FFFFFF"/>
           </w:tcPr>
           <w:p>
             <w:pPr>
-              <w:spacing w:after="80" w:before="80"/>
+              <w:spacing w:before="80" w:after="80"/>
             </w:pPr>
             <w:r>
               <w:rPr>
@@ -2676,20 +2038,12 @@
         </w:tc>
         <w:tc>
           <w:tcPr>
-            <w:tcW w:type="dxa" w:w="4025"/>
-            <w:tcBorders>
-              <w:top w:val="single" w:sz="4" w:color="D9D9D9"/>
-              <w:left w:val="single" w:sz="4" w:color="D9D9D9"/>
-              <w:bottom w:val="single" w:sz="4" w:color="D9D9D9"/>
-              <w:right w:val="single" w:sz="4" w:color="D9D9D9"/>
-              <w:insideH w:val="single" w:sz="4" w:color="D9D9D9"/>
-              <w:insideV w:val="single" w:sz="4" w:color="D9D9D9"/>
-            </w:tcBorders>
+            <w:tcW w:type="dxa" w:w="4082"/>
             <w:shd w:fill="FFFFFF"/>
           </w:tcPr>
           <w:p>
             <w:pPr>
-              <w:spacing w:after="80" w:before="80"/>
+              <w:spacing w:before="80" w:after="80"/>
             </w:pPr>
             <w:r>
               <w:rPr>
@@ -2708,20 +2062,12 @@
         </w:trPr>
         <w:tc>
           <w:tcPr>
-            <w:tcW w:type="dxa" w:w="2381"/>
-            <w:tcBorders>
-              <w:top w:val="single" w:sz="4" w:color="D9D9D9"/>
-              <w:left w:val="single" w:sz="4" w:color="D9D9D9"/>
-              <w:bottom w:val="single" w:sz="4" w:color="D9D9D9"/>
-              <w:right w:val="single" w:sz="4" w:color="D9D9D9"/>
-              <w:insideH w:val="single" w:sz="4" w:color="D9D9D9"/>
-              <w:insideV w:val="single" w:sz="4" w:color="D9D9D9"/>
-            </w:tcBorders>
+            <w:tcW w:type="dxa" w:w="2324"/>
             <w:shd w:fill="F2F5F7"/>
           </w:tcPr>
           <w:p>
             <w:pPr>
-              <w:spacing w:after="80" w:before="80"/>
+              <w:spacing w:before="80" w:after="80"/>
             </w:pPr>
             <w:r>
               <w:rPr>
@@ -2736,19 +2082,11 @@
         <w:tc>
           <w:tcPr>
             <w:tcW w:type="dxa" w:w="3458"/>
-            <w:tcBorders>
-              <w:top w:val="single" w:sz="4" w:color="D9D9D9"/>
-              <w:left w:val="single" w:sz="4" w:color="D9D9D9"/>
-              <w:bottom w:val="single" w:sz="4" w:color="D9D9D9"/>
-              <w:right w:val="single" w:sz="4" w:color="D9D9D9"/>
-              <w:insideH w:val="single" w:sz="4" w:color="D9D9D9"/>
-              <w:insideV w:val="single" w:sz="4" w:color="D9D9D9"/>
-            </w:tcBorders>
             <w:shd w:fill="F2F5F7"/>
           </w:tcPr>
           <w:p>
             <w:pPr>
-              <w:spacing w:after="80" w:before="80"/>
+              <w:spacing w:before="80" w:after="80"/>
             </w:pPr>
             <w:r>
               <w:rPr>
@@ -2762,20 +2100,12 @@
         </w:tc>
         <w:tc>
           <w:tcPr>
-            <w:tcW w:type="dxa" w:w="4025"/>
-            <w:tcBorders>
-              <w:top w:val="single" w:sz="4" w:color="D9D9D9"/>
-              <w:left w:val="single" w:sz="4" w:color="D9D9D9"/>
-              <w:bottom w:val="single" w:sz="4" w:color="D9D9D9"/>
-              <w:right w:val="single" w:sz="4" w:color="D9D9D9"/>
-              <w:insideH w:val="single" w:sz="4" w:color="D9D9D9"/>
-              <w:insideV w:val="single" w:sz="4" w:color="D9D9D9"/>
-            </w:tcBorders>
+            <w:tcW w:type="dxa" w:w="4082"/>
             <w:shd w:fill="F2F5F7"/>
           </w:tcPr>
           <w:p>
             <w:pPr>
-              <w:spacing w:after="80" w:before="80"/>
+              <w:spacing w:before="80" w:after="80"/>
             </w:pPr>
             <w:r>
               <w:rPr>
@@ -2799,6 +2129,7 @@
       </w:r>
     </w:p>
     <w:p>
+      <w:pPr/>
       <w:r>
         <w:t>CreditRelation, CollectProfile, CollectSegment, CollectTask, PromiseItem, DisputeItem, CaseAttachment.</w:t>
       </w:r>
@@ -2812,16 +2143,19 @@
       </w:r>
     </w:p>
     <w:p>
+      <w:pPr/>
       <w:r>
         <w:t>Obligo-, Zusage- und Streitfallbeträge enthalten ihre gespeicherte Währung. Kreditlimit-Währungsbezug, Rechnungsverknüpfungen und Anlagen bleiben offen. Allgemeine Fallattribute enthalten mehrere Fallarten.</w:t>
       </w:r>
     </w:p>
     <w:p>
+      <w:pPr/>
       <w:r>
         <w:t>Vollständige Feldzuordnung und Quellen: Produkthandbuch, PROVENANCE.md und Native-Coverage.csv.</w:t>
       </w:r>
     </w:p>
     <w:p>
+      <w:pPr/>
       <w:r>
         <w:t>Products: fscm_mig_src and fscm_mig_s4</w:t>
       </w:r>
@@ -2840,6 +2174,7 @@
       </w:r>
     </w:p>
     <w:p>
+      <w:pPr/>
       <w:r>
         <w:t>6 native Entwürfe; 17 offene Strukturen. Alle SAP-Prüfungen stehen aus.</w:t>
       </w:r>
@@ -2851,31 +2186,23 @@
         <w:tblLook w:firstColumn="1" w:firstRow="1" w:lastColumn="0" w:lastRow="0" w:noHBand="0" w:noVBand="1" w:val="04A0"/>
       </w:tblPr>
       <w:tblGrid>
-        <w:gridCol w:w="2381"/>
-        <w:gridCol w:w="3458"/>
-        <w:gridCol w:w="4025"/>
+        <w:gridCol w:w="3289"/>
+        <w:gridCol w:w="3289"/>
+        <w:gridCol w:w="3289"/>
       </w:tblGrid>
       <w:tr>
         <w:trPr>
+          <w:cantSplit/>
           <w:tblHeader/>
-          <w:cantSplit/>
         </w:trPr>
         <w:tc>
           <w:tcPr>
-            <w:tcW w:type="dxa" w:w="2381"/>
-            <w:tcBorders>
-              <w:top w:val="single" w:sz="4" w:color="D9D9D9"/>
-              <w:left w:val="single" w:sz="4" w:color="D9D9D9"/>
-              <w:bottom w:val="single" w:sz="4" w:color="D9D9D9"/>
-              <w:right w:val="single" w:sz="4" w:color="D9D9D9"/>
-              <w:insideH w:val="single" w:sz="4" w:color="D9D9D9"/>
-              <w:insideV w:val="single" w:sz="4" w:color="D9D9D9"/>
-            </w:tcBorders>
+            <w:tcW w:type="dxa" w:w="2324"/>
             <w:shd w:fill="273D50"/>
           </w:tcPr>
           <w:p>
             <w:pPr>
-              <w:spacing w:after="80" w:before="80"/>
+              <w:spacing w:before="80" w:after="80"/>
             </w:pPr>
             <w:r>
               <w:rPr>
@@ -2890,19 +2217,11 @@
         <w:tc>
           <w:tcPr>
             <w:tcW w:type="dxa" w:w="3458"/>
-            <w:tcBorders>
-              <w:top w:val="single" w:sz="4" w:color="D9D9D9"/>
-              <w:left w:val="single" w:sz="4" w:color="D9D9D9"/>
-              <w:bottom w:val="single" w:sz="4" w:color="D9D9D9"/>
-              <w:right w:val="single" w:sz="4" w:color="D9D9D9"/>
-              <w:insideH w:val="single" w:sz="4" w:color="D9D9D9"/>
-              <w:insideV w:val="single" w:sz="4" w:color="D9D9D9"/>
-            </w:tcBorders>
             <w:shd w:fill="273D50"/>
           </w:tcPr>
           <w:p>
             <w:pPr>
-              <w:spacing w:after="80" w:before="80"/>
+              <w:spacing w:before="80" w:after="80"/>
             </w:pPr>
             <w:r>
               <w:rPr>
@@ -2916,20 +2235,12 @@
         </w:tc>
         <w:tc>
           <w:tcPr>
-            <w:tcW w:type="dxa" w:w="4025"/>
-            <w:tcBorders>
-              <w:top w:val="single" w:sz="4" w:color="D9D9D9"/>
-              <w:left w:val="single" w:sz="4" w:color="D9D9D9"/>
-              <w:bottom w:val="single" w:sz="4" w:color="D9D9D9"/>
-              <w:right w:val="single" w:sz="4" w:color="D9D9D9"/>
-              <w:insideH w:val="single" w:sz="4" w:color="D9D9D9"/>
-              <w:insideV w:val="single" w:sz="4" w:color="D9D9D9"/>
-            </w:tcBorders>
+            <w:tcW w:type="dxa" w:w="4082"/>
             <w:shd w:fill="273D50"/>
           </w:tcPr>
           <w:p>
             <w:pPr>
-              <w:spacing w:after="80" w:before="80"/>
+              <w:spacing w:before="80" w:after="80"/>
             </w:pPr>
             <w:r>
               <w:rPr>
@@ -2948,20 +2259,12 @@
         </w:trPr>
         <w:tc>
           <w:tcPr>
-            <w:tcW w:type="dxa" w:w="2381"/>
-            <w:tcBorders>
-              <w:top w:val="single" w:sz="4" w:color="D9D9D9"/>
-              <w:left w:val="single" w:sz="4" w:color="D9D9D9"/>
-              <w:bottom w:val="single" w:sz="4" w:color="D9D9D9"/>
-              <w:right w:val="single" w:sz="4" w:color="D9D9D9"/>
-              <w:insideH w:val="single" w:sz="4" w:color="D9D9D9"/>
-              <w:insideV w:val="single" w:sz="4" w:color="D9D9D9"/>
-            </w:tcBorders>
+            <w:tcW w:type="dxa" w:w="2324"/>
             <w:shd w:fill="F2F5F7"/>
           </w:tcPr>
           <w:p>
             <w:pPr>
-              <w:spacing w:after="80" w:before="80"/>
+              <w:spacing w:before="80" w:after="80"/>
             </w:pPr>
             <w:r>
               <w:rPr>
@@ -2976,19 +2279,11 @@
         <w:tc>
           <w:tcPr>
             <w:tcW w:type="dxa" w:w="3458"/>
-            <w:tcBorders>
-              <w:top w:val="single" w:sz="4" w:color="D9D9D9"/>
-              <w:left w:val="single" w:sz="4" w:color="D9D9D9"/>
-              <w:bottom w:val="single" w:sz="4" w:color="D9D9D9"/>
-              <w:right w:val="single" w:sz="4" w:color="D9D9D9"/>
-              <w:insideH w:val="single" w:sz="4" w:color="D9D9D9"/>
-              <w:insideV w:val="single" w:sz="4" w:color="D9D9D9"/>
-            </w:tcBorders>
             <w:shd w:fill="F2F5F7"/>
           </w:tcPr>
           <w:p>
             <w:pPr>
-              <w:spacing w:after="80" w:before="80"/>
+              <w:spacing w:before="80" w:after="80"/>
             </w:pPr>
             <w:r>
               <w:rPr>
@@ -3002,20 +2297,12 @@
         </w:tc>
         <w:tc>
           <w:tcPr>
-            <w:tcW w:type="dxa" w:w="4025"/>
-            <w:tcBorders>
-              <w:top w:val="single" w:sz="4" w:color="D9D9D9"/>
-              <w:left w:val="single" w:sz="4" w:color="D9D9D9"/>
-              <w:bottom w:val="single" w:sz="4" w:color="D9D9D9"/>
-              <w:right w:val="single" w:sz="4" w:color="D9D9D9"/>
-              <w:insideH w:val="single" w:sz="4" w:color="D9D9D9"/>
-              <w:insideV w:val="single" w:sz="4" w:color="D9D9D9"/>
-            </w:tcBorders>
+            <w:tcW w:type="dxa" w:w="4082"/>
             <w:shd w:fill="F2F5F7"/>
           </w:tcPr>
           <w:p>
             <w:pPr>
-              <w:spacing w:after="80" w:before="80"/>
+              <w:spacing w:before="80" w:after="80"/>
             </w:pPr>
             <w:r>
               <w:rPr>
@@ -3034,20 +2321,12 @@
         </w:trPr>
         <w:tc>
           <w:tcPr>
-            <w:tcW w:type="dxa" w:w="2381"/>
-            <w:tcBorders>
-              <w:top w:val="single" w:sz="4" w:color="D9D9D9"/>
-              <w:left w:val="single" w:sz="4" w:color="D9D9D9"/>
-              <w:bottom w:val="single" w:sz="4" w:color="D9D9D9"/>
-              <w:right w:val="single" w:sz="4" w:color="D9D9D9"/>
-              <w:insideH w:val="single" w:sz="4" w:color="D9D9D9"/>
-              <w:insideV w:val="single" w:sz="4" w:color="D9D9D9"/>
-            </w:tcBorders>
+            <w:tcW w:type="dxa" w:w="2324"/>
             <w:shd w:fill="FFFFFF"/>
           </w:tcPr>
           <w:p>
             <w:pPr>
-              <w:spacing w:after="80" w:before="80"/>
+              <w:spacing w:before="80" w:after="80"/>
             </w:pPr>
             <w:r>
               <w:rPr>
@@ -3062,19 +2341,11 @@
         <w:tc>
           <w:tcPr>
             <w:tcW w:type="dxa" w:w="3458"/>
-            <w:tcBorders>
-              <w:top w:val="single" w:sz="4" w:color="D9D9D9"/>
-              <w:left w:val="single" w:sz="4" w:color="D9D9D9"/>
-              <w:bottom w:val="single" w:sz="4" w:color="D9D9D9"/>
-              <w:right w:val="single" w:sz="4" w:color="D9D9D9"/>
-              <w:insideH w:val="single" w:sz="4" w:color="D9D9D9"/>
-              <w:insideV w:val="single" w:sz="4" w:color="D9D9D9"/>
-            </w:tcBorders>
             <w:shd w:fill="FFFFFF"/>
           </w:tcPr>
           <w:p>
             <w:pPr>
-              <w:spacing w:after="80" w:before="80"/>
+              <w:spacing w:before="80" w:after="80"/>
             </w:pPr>
             <w:r>
               <w:rPr>
@@ -3088,20 +2359,12 @@
         </w:tc>
         <w:tc>
           <w:tcPr>
-            <w:tcW w:type="dxa" w:w="4025"/>
-            <w:tcBorders>
-              <w:top w:val="single" w:sz="4" w:color="D9D9D9"/>
-              <w:left w:val="single" w:sz="4" w:color="D9D9D9"/>
-              <w:bottom w:val="single" w:sz="4" w:color="D9D9D9"/>
-              <w:right w:val="single" w:sz="4" w:color="D9D9D9"/>
-              <w:insideH w:val="single" w:sz="4" w:color="D9D9D9"/>
-              <w:insideV w:val="single" w:sz="4" w:color="D9D9D9"/>
-            </w:tcBorders>
+            <w:tcW w:type="dxa" w:w="4082"/>
             <w:shd w:fill="FFFFFF"/>
           </w:tcPr>
           <w:p>
             <w:pPr>
-              <w:spacing w:after="80" w:before="80"/>
+              <w:spacing w:before="80" w:after="80"/>
             </w:pPr>
             <w:r>
               <w:rPr>
@@ -3120,20 +2383,12 @@
         </w:trPr>
         <w:tc>
           <w:tcPr>
-            <w:tcW w:type="dxa" w:w="2381"/>
-            <w:tcBorders>
-              <w:top w:val="single" w:sz="4" w:color="D9D9D9"/>
-              <w:left w:val="single" w:sz="4" w:color="D9D9D9"/>
-              <w:bottom w:val="single" w:sz="4" w:color="D9D9D9"/>
-              <w:right w:val="single" w:sz="4" w:color="D9D9D9"/>
-              <w:insideH w:val="single" w:sz="4" w:color="D9D9D9"/>
-              <w:insideV w:val="single" w:sz="4" w:color="D9D9D9"/>
-            </w:tcBorders>
+            <w:tcW w:type="dxa" w:w="2324"/>
             <w:shd w:fill="F2F5F7"/>
           </w:tcPr>
           <w:p>
             <w:pPr>
-              <w:spacing w:after="80" w:before="80"/>
+              <w:spacing w:before="80" w:after="80"/>
             </w:pPr>
             <w:r>
               <w:rPr>
@@ -3148,19 +2403,11 @@
         <w:tc>
           <w:tcPr>
             <w:tcW w:type="dxa" w:w="3458"/>
-            <w:tcBorders>
-              <w:top w:val="single" w:sz="4" w:color="D9D9D9"/>
-              <w:left w:val="single" w:sz="4" w:color="D9D9D9"/>
-              <w:bottom w:val="single" w:sz="4" w:color="D9D9D9"/>
-              <w:right w:val="single" w:sz="4" w:color="D9D9D9"/>
-              <w:insideH w:val="single" w:sz="4" w:color="D9D9D9"/>
-              <w:insideV w:val="single" w:sz="4" w:color="D9D9D9"/>
-            </w:tcBorders>
             <w:shd w:fill="F2F5F7"/>
           </w:tcPr>
           <w:p>
             <w:pPr>
-              <w:spacing w:after="80" w:before="80"/>
+              <w:spacing w:before="80" w:after="80"/>
             </w:pPr>
             <w:r>
               <w:rPr>
@@ -3174,20 +2421,12 @@
         </w:tc>
         <w:tc>
           <w:tcPr>
-            <w:tcW w:type="dxa" w:w="4025"/>
-            <w:tcBorders>
-              <w:top w:val="single" w:sz="4" w:color="D9D9D9"/>
-              <w:left w:val="single" w:sz="4" w:color="D9D9D9"/>
-              <w:bottom w:val="single" w:sz="4" w:color="D9D9D9"/>
-              <w:right w:val="single" w:sz="4" w:color="D9D9D9"/>
-              <w:insideH w:val="single" w:sz="4" w:color="D9D9D9"/>
-              <w:insideV w:val="single" w:sz="4" w:color="D9D9D9"/>
-            </w:tcBorders>
+            <w:tcW w:type="dxa" w:w="4082"/>
             <w:shd w:fill="F2F5F7"/>
           </w:tcPr>
           <w:p>
             <w:pPr>
-              <w:spacing w:after="80" w:before="80"/>
+              <w:spacing w:before="80" w:after="80"/>
             </w:pPr>
             <w:r>
               <w:rPr>
@@ -3206,20 +2445,12 @@
         </w:trPr>
         <w:tc>
           <w:tcPr>
-            <w:tcW w:type="dxa" w:w="2381"/>
-            <w:tcBorders>
-              <w:top w:val="single" w:sz="4" w:color="D9D9D9"/>
-              <w:left w:val="single" w:sz="4" w:color="D9D9D9"/>
-              <w:bottom w:val="single" w:sz="4" w:color="D9D9D9"/>
-              <w:right w:val="single" w:sz="4" w:color="D9D9D9"/>
-              <w:insideH w:val="single" w:sz="4" w:color="D9D9D9"/>
-              <w:insideV w:val="single" w:sz="4" w:color="D9D9D9"/>
-            </w:tcBorders>
+            <w:tcW w:type="dxa" w:w="2324"/>
             <w:shd w:fill="FFFFFF"/>
           </w:tcPr>
           <w:p>
             <w:pPr>
-              <w:spacing w:after="80" w:before="80"/>
+              <w:spacing w:before="80" w:after="80"/>
             </w:pPr>
             <w:r>
               <w:rPr>
@@ -3234,19 +2465,11 @@
         <w:tc>
           <w:tcPr>
             <w:tcW w:type="dxa" w:w="3458"/>
-            <w:tcBorders>
-              <w:top w:val="single" w:sz="4" w:color="D9D9D9"/>
-              <w:left w:val="single" w:sz="4" w:color="D9D9D9"/>
-              <w:bottom w:val="single" w:sz="4" w:color="D9D9D9"/>
-              <w:right w:val="single" w:sz="4" w:color="D9D9D9"/>
-              <w:insideH w:val="single" w:sz="4" w:color="D9D9D9"/>
-              <w:insideV w:val="single" w:sz="4" w:color="D9D9D9"/>
-            </w:tcBorders>
             <w:shd w:fill="FFFFFF"/>
           </w:tcPr>
           <w:p>
             <w:pPr>
-              <w:spacing w:after="80" w:before="80"/>
+              <w:spacing w:before="80" w:after="80"/>
             </w:pPr>
             <w:r>
               <w:rPr>
@@ -3260,20 +2483,12 @@
         </w:tc>
         <w:tc>
           <w:tcPr>
-            <w:tcW w:type="dxa" w:w="4025"/>
-            <w:tcBorders>
-              <w:top w:val="single" w:sz="4" w:color="D9D9D9"/>
-              <w:left w:val="single" w:sz="4" w:color="D9D9D9"/>
-              <w:bottom w:val="single" w:sz="4" w:color="D9D9D9"/>
-              <w:right w:val="single" w:sz="4" w:color="D9D9D9"/>
-              <w:insideH w:val="single" w:sz="4" w:color="D9D9D9"/>
-              <w:insideV w:val="single" w:sz="4" w:color="D9D9D9"/>
-            </w:tcBorders>
+            <w:tcW w:type="dxa" w:w="4082"/>
             <w:shd w:fill="FFFFFF"/>
           </w:tcPr>
           <w:p>
             <w:pPr>
-              <w:spacing w:after="80" w:before="80"/>
+              <w:spacing w:before="80" w:after="80"/>
             </w:pPr>
             <w:r>
               <w:rPr>
@@ -3292,20 +2507,12 @@
         </w:trPr>
         <w:tc>
           <w:tcPr>
-            <w:tcW w:type="dxa" w:w="2381"/>
-            <w:tcBorders>
-              <w:top w:val="single" w:sz="4" w:color="D9D9D9"/>
-              <w:left w:val="single" w:sz="4" w:color="D9D9D9"/>
-              <w:bottom w:val="single" w:sz="4" w:color="D9D9D9"/>
-              <w:right w:val="single" w:sz="4" w:color="D9D9D9"/>
-              <w:insideH w:val="single" w:sz="4" w:color="D9D9D9"/>
-              <w:insideV w:val="single" w:sz="4" w:color="D9D9D9"/>
-            </w:tcBorders>
+            <w:tcW w:type="dxa" w:w="2324"/>
             <w:shd w:fill="F2F5F7"/>
           </w:tcPr>
           <w:p>
             <w:pPr>
-              <w:spacing w:after="80" w:before="80"/>
+              <w:spacing w:before="80" w:after="80"/>
             </w:pPr>
             <w:r>
               <w:rPr>
@@ -3320,19 +2527,11 @@
         <w:tc>
           <w:tcPr>
             <w:tcW w:type="dxa" w:w="3458"/>
-            <w:tcBorders>
-              <w:top w:val="single" w:sz="4" w:color="D9D9D9"/>
-              <w:left w:val="single" w:sz="4" w:color="D9D9D9"/>
-              <w:bottom w:val="single" w:sz="4" w:color="D9D9D9"/>
-              <w:right w:val="single" w:sz="4" w:color="D9D9D9"/>
-              <w:insideH w:val="single" w:sz="4" w:color="D9D9D9"/>
-              <w:insideV w:val="single" w:sz="4" w:color="D9D9D9"/>
-            </w:tcBorders>
             <w:shd w:fill="F2F5F7"/>
           </w:tcPr>
           <w:p>
             <w:pPr>
-              <w:spacing w:after="80" w:before="80"/>
+              <w:spacing w:before="80" w:after="80"/>
             </w:pPr>
             <w:r>
               <w:rPr>
@@ -3346,20 +2545,12 @@
         </w:tc>
         <w:tc>
           <w:tcPr>
-            <w:tcW w:type="dxa" w:w="4025"/>
-            <w:tcBorders>
-              <w:top w:val="single" w:sz="4" w:color="D9D9D9"/>
-              <w:left w:val="single" w:sz="4" w:color="D9D9D9"/>
-              <w:bottom w:val="single" w:sz="4" w:color="D9D9D9"/>
-              <w:right w:val="single" w:sz="4" w:color="D9D9D9"/>
-              <w:insideH w:val="single" w:sz="4" w:color="D9D9D9"/>
-              <w:insideV w:val="single" w:sz="4" w:color="D9D9D9"/>
-            </w:tcBorders>
+            <w:tcW w:type="dxa" w:w="4082"/>
             <w:shd w:fill="F2F5F7"/>
           </w:tcPr>
           <w:p>
             <w:pPr>
-              <w:spacing w:after="80" w:before="80"/>
+              <w:spacing w:before="80" w:after="80"/>
             </w:pPr>
             <w:r>
               <w:rPr>
@@ -3378,20 +2569,12 @@
         </w:trPr>
         <w:tc>
           <w:tcPr>
-            <w:tcW w:type="dxa" w:w="2381"/>
-            <w:tcBorders>
-              <w:top w:val="single" w:sz="4" w:color="D9D9D9"/>
-              <w:left w:val="single" w:sz="4" w:color="D9D9D9"/>
-              <w:bottom w:val="single" w:sz="4" w:color="D9D9D9"/>
-              <w:right w:val="single" w:sz="4" w:color="D9D9D9"/>
-              <w:insideH w:val="single" w:sz="4" w:color="D9D9D9"/>
-              <w:insideV w:val="single" w:sz="4" w:color="D9D9D9"/>
-            </w:tcBorders>
+            <w:tcW w:type="dxa" w:w="2324"/>
             <w:shd w:fill="FFFFFF"/>
           </w:tcPr>
           <w:p>
             <w:pPr>
-              <w:spacing w:after="80" w:before="80"/>
+              <w:spacing w:before="80" w:after="80"/>
             </w:pPr>
             <w:r>
               <w:rPr>
@@ -3406,19 +2589,11 @@
         <w:tc>
           <w:tcPr>
             <w:tcW w:type="dxa" w:w="3458"/>
-            <w:tcBorders>
-              <w:top w:val="single" w:sz="4" w:color="D9D9D9"/>
-              <w:left w:val="single" w:sz="4" w:color="D9D9D9"/>
-              <w:bottom w:val="single" w:sz="4" w:color="D9D9D9"/>
-              <w:right w:val="single" w:sz="4" w:color="D9D9D9"/>
-              <w:insideH w:val="single" w:sz="4" w:color="D9D9D9"/>
-              <w:insideV w:val="single" w:sz="4" w:color="D9D9D9"/>
-            </w:tcBorders>
             <w:shd w:fill="FFFFFF"/>
           </w:tcPr>
           <w:p>
             <w:pPr>
-              <w:spacing w:after="80" w:before="80"/>
+              <w:spacing w:before="80" w:after="80"/>
             </w:pPr>
             <w:r>
               <w:rPr>
@@ -3432,20 +2607,12 @@
         </w:tc>
         <w:tc>
           <w:tcPr>
-            <w:tcW w:type="dxa" w:w="4025"/>
-            <w:tcBorders>
-              <w:top w:val="single" w:sz="4" w:color="D9D9D9"/>
-              <w:left w:val="single" w:sz="4" w:color="D9D9D9"/>
-              <w:bottom w:val="single" w:sz="4" w:color="D9D9D9"/>
-              <w:right w:val="single" w:sz="4" w:color="D9D9D9"/>
-              <w:insideH w:val="single" w:sz="4" w:color="D9D9D9"/>
-              <w:insideV w:val="single" w:sz="4" w:color="D9D9D9"/>
-            </w:tcBorders>
+            <w:tcW w:type="dxa" w:w="4082"/>
             <w:shd w:fill="FFFFFF"/>
           </w:tcPr>
           <w:p>
             <w:pPr>
-              <w:spacing w:after="80" w:before="80"/>
+              <w:spacing w:before="80" w:after="80"/>
             </w:pPr>
             <w:r>
               <w:rPr>
@@ -3469,6 +2636,7 @@
       </w:r>
     </w:p>
     <w:p>
+      <w:pPr/>
       <w:r>
         <w:t>EHSLocation, EHSLocHierarchy, ChemicalProp, PropertyUnit, SpecProperty, IncidentPerson, RiskAssessment, RiskHazard, RiskControl, DataClassifier, DataCollection, Measurement, ComplianceReq, ComplianceScen, ComplianceLink, DangerousGoods, DGTransport.</w:t>
       </w:r>
@@ -3482,16 +2650,19 @@
       </w:r>
     </w:p>
     <w:p>
+      <w:pPr/>
       <w:r>
         <w:t>RECN und ACTN erhalten den Änderungsstand. Kein ungeprüfter Filter auf aktuelle Datensätze. Phrasen liefern Kopf-/Zuordnungsdaten; mehrsprachige Texte und Eigenschaften bleiben offen. Vorfall- und Maßnahmenwurzeln sind enthalten; Maßnahmenreferenzen, Personen und Risiko-, Umwelt- und Compliance-Strukturen bleiben offen.</w:t>
       </w:r>
     </w:p>
     <w:p>
+      <w:pPr/>
       <w:r>
         <w:t>Vollständige Feldzuordnung und Quellen: Produkthandbuch, PROVENANCE.md und Native-Coverage.csv.</w:t>
       </w:r>
     </w:p>
     <w:p>
+      <w:pPr/>
       <w:r>
         <w:t>Products: ehs_mig_src and ehs_mig_s4</w:t>
       </w:r>
@@ -3870,7 +3041,7 @@
     <w:qFormat/>
     <w:rsid w:val="00FC693F"/>
     <w:pPr>
-      <w:spacing w:after="140" w:line="264" w:lineRule="auto"/>
+      <w:spacing w:line="276" w:lineRule="auto" w:after="140"/>
     </w:pPr>
     <w:rPr>
       <w:rFonts w:ascii="Calibri" w:hAnsi="Calibri"/>
@@ -3933,7 +3104,7 @@
     <w:pPr>
       <w:keepNext/>
       <w:keepLines/>
-      <w:spacing w:before="480" w:after="0"/>
+      <w:spacing w:before="480" w:after="140" w:line="276" w:lineRule="auto"/>
       <w:outlineLvl w:val="0"/>
     </w:pPr>
     <w:rPr>
@@ -3957,7 +3128,7 @@
     <w:pPr>
       <w:keepNext/>
       <w:keepLines/>
-      <w:spacing w:before="200" w:after="0"/>
+      <w:spacing w:before="200" w:after="140" w:line="276" w:lineRule="auto"/>
       <w:outlineLvl w:val="1"/>
     </w:pPr>
     <w:rPr>
@@ -4219,7 +3390,7 @@
     <w:qFormat/>
     <w:rsid w:val="00FC693F"/>
     <w:pPr>
-      <w:spacing w:after="300" w:line="240" w:lineRule="auto"/>
+      <w:spacing w:after="140" w:line="276" w:lineRule="auto"/>
       <w:contextualSpacing/>
     </w:pPr>
     <w:rPr>
@@ -4227,7 +3398,7 @@
       <w:color w:val="000000"/>
       <w:spacing w:val="5"/>
       <w:kern w:val="28"/>
-      <w:sz w:val="48"/>
+      <w:sz w:val="46"/>
       <w:szCs w:val="52"/>
     </w:rPr>
   </w:style>
@@ -4260,10 +3431,10 @@
       </w:numPr>
     </w:pPr>
     <w:rPr>
-      <w:rFonts w:asciiTheme="majorHAnsi" w:eastAsiaTheme="majorEastAsia" w:hAnsiTheme="majorHAnsi" w:cstheme="majorBidi" w:ascii="Calibri" w:hAnsi="Calibri"/>
+      <w:rFonts w:asciiTheme="majorHAnsi" w:eastAsiaTheme="majorEastAsia" w:hAnsiTheme="majorHAnsi" w:cstheme="majorBidi"/>
       <w:i/>
       <w:iCs/>
-      <w:color w:val="000000"/>
+      <w:color w:val="4F81BD" w:themeColor="accent1"/>
       <w:spacing w:val="15"/>
       <w:sz w:val="24"/>
       <w:szCs w:val="24"/>

</xml_diff>